<commit_message>
add  ref multiple testing
</commit_message>
<xml_diff>
--- a/doc/SAP/StatisticalAnalysisPlan-template.docx
+++ b/doc/SAP/StatisticalAnalysisPlan-template.docx
@@ -8668,14 +8668,7 @@
           <w:color w:val="215E99" w:themeColor="text2" w:themeTint="BF"/>
           <w:lang w:val="en-US"/>
         </w:rPr>
-        <w:t xml:space="preserve">While the </w:t>
-      </w:r>
-      <w:r>
-        <w:rPr>
-          <w:color w:val="215E99" w:themeColor="text2" w:themeTint="BF"/>
-          <w:lang w:val="en-US"/>
-        </w:rPr>
-        <w:t xml:space="preserve">primary analysis </w:t>
+        <w:t xml:space="preserve">While the primary analysis </w:t>
       </w:r>
       <w:r>
         <w:rPr>
@@ -8717,14 +8710,7 @@
           <w:color w:val="215E99" w:themeColor="text2" w:themeTint="BF"/>
           <w:lang w:val="en-US"/>
         </w:rPr>
-        <w:t>calculation</w:t>
-      </w:r>
-      <w:r>
-        <w:rPr>
-          <w:color w:val="215E99" w:themeColor="text2" w:themeTint="BF"/>
-          <w:lang w:val="en-US"/>
-        </w:rPr>
-        <w:t>, the secondary analyses have various</w:t>
+        <w:t>calculation, the secondary analyses have various</w:t>
       </w:r>
       <w:r>
         <w:rPr>
@@ -8795,34 +8781,7 @@
           <w:color w:val="215E99" w:themeColor="text2" w:themeTint="BF"/>
           <w:lang w:val="en-US"/>
         </w:rPr>
-        <w:t>separate components of</w:t>
-      </w:r>
-      <w:r>
-        <w:rPr>
-          <w:i/>
-          <w:iCs/>
-          <w:color w:val="215E99" w:themeColor="text2" w:themeTint="BF"/>
-          <w:lang w:val="en-US"/>
-        </w:rPr>
-        <w:t xml:space="preserve"> </w:t>
-      </w:r>
-      <w:r>
-        <w:rPr>
-          <w:i/>
-          <w:iCs/>
-          <w:color w:val="215E99" w:themeColor="text2" w:themeTint="BF"/>
-          <w:lang w:val="en-US"/>
-        </w:rPr>
-        <w:t xml:space="preserve">the primary </w:t>
-      </w:r>
-      <w:r>
-        <w:rPr>
-          <w:i/>
-          <w:iCs/>
-          <w:color w:val="215E99" w:themeColor="text2" w:themeTint="BF"/>
-          <w:lang w:val="en-US"/>
-        </w:rPr>
-        <w:t>outcome:</w:t>
+        <w:t>separate components of the primary outcome:</w:t>
       </w:r>
       <w:r>
         <w:rPr>
@@ -8860,43 +8819,7 @@
           <w:color w:val="215E99" w:themeColor="text2" w:themeTint="BF"/>
           <w:lang w:val="en-US"/>
         </w:rPr>
-        <w:t>a</w:t>
-      </w:r>
-      <w:r>
-        <w:rPr>
-          <w:i/>
-          <w:iCs/>
-          <w:color w:val="215E99" w:themeColor="text2" w:themeTint="BF"/>
-          <w:lang w:val="en-US"/>
-        </w:rPr>
-        <w:t xml:space="preserve">iding in understanding the </w:t>
-      </w:r>
-      <w:r>
-        <w:rPr>
-          <w:i/>
-          <w:iCs/>
-          <w:color w:val="215E99" w:themeColor="text2" w:themeTint="BF"/>
-          <w:lang w:val="en-US"/>
-        </w:rPr>
-        <w:t xml:space="preserve">treatment </w:t>
-      </w:r>
-      <w:r>
-        <w:rPr>
-          <w:i/>
-          <w:iCs/>
-          <w:color w:val="215E99" w:themeColor="text2" w:themeTint="BF"/>
-          <w:lang w:val="en-US"/>
-        </w:rPr>
-        <w:t>mechanism</w:t>
-      </w:r>
-      <w:r>
-        <w:rPr>
-          <w:i/>
-          <w:iCs/>
-          <w:color w:val="215E99" w:themeColor="text2" w:themeTint="BF"/>
-          <w:lang w:val="en-US"/>
-        </w:rPr>
-        <w:t>:</w:t>
+        <w:t>aiding in understanding the treatment mechanism:</w:t>
       </w:r>
       <w:r>
         <w:rPr>
@@ -9515,7 +9438,26 @@
           <w:color w:val="215E99" w:themeColor="text2" w:themeTint="BF"/>
           <w:lang w:val="en-US"/>
         </w:rPr>
-        <w:t xml:space="preserve"> is more controversial</w:t>
+        <w:t xml:space="preserve"> is </w:t>
+      </w:r>
+      <w:commentRangeStart w:id="35"/>
+      <w:r>
+        <w:rPr>
+          <w:color w:val="215E99" w:themeColor="text2" w:themeTint="BF"/>
+          <w:lang w:val="en-US"/>
+        </w:rPr>
+        <w:t>more controversial</w:t>
+      </w:r>
+      <w:commentRangeEnd w:id="35"/>
+      <w:r>
+        <w:rPr>
+          <w:rStyle w:val="Kommentarhenvisning"/>
+          <w:color w:val="215E99" w:themeColor="text2" w:themeTint="BF"/>
+          <w:sz w:val="24"/>
+          <w:szCs w:val="24"/>
+          <w:lang w:val="en-US"/>
+        </w:rPr>
+        <w:commentReference w:id="35"/>
       </w:r>
     </w:p>
     <w:p>
@@ -9538,7 +9480,7 @@
         </w:rPr>
         <w:t xml:space="preserve">To make a (confirmatory) claim about secondary hypotheses, regulatory agencies such as </w:t>
       </w:r>
-      <w:commentRangeStart w:id="35"/>
+      <w:commentRangeStart w:id="36"/>
       <w:r>
         <w:rPr>
           <w:color w:val="215E99" w:themeColor="text2" w:themeTint="BF"/>
@@ -9546,7 +9488,7 @@
         </w:rPr>
         <w:t xml:space="preserve">EMA </w:t>
       </w:r>
-      <w:commentRangeEnd w:id="35"/>
+      <w:commentRangeEnd w:id="36"/>
       <w:r>
         <w:rPr>
           <w:rStyle w:val="Kommentarhenvisning"/>
@@ -9555,7 +9497,7 @@
           <w:szCs w:val="24"/>
           <w:lang w:val="en-US"/>
         </w:rPr>
-        <w:commentReference w:id="35"/>
+        <w:commentReference w:id="36"/>
       </w:r>
       <w:r>
         <w:rPr>
@@ -9725,7 +9667,7 @@
         </w:rPr>
         <w:t xml:space="preserve">From </w:t>
       </w:r>
-      <w:commentRangeStart w:id="36"/>
+      <w:commentRangeStart w:id="37"/>
       <w:r>
         <w:rPr>
           <w:color w:val="215E99" w:themeColor="text2" w:themeTint="BF"/>
@@ -9733,7 +9675,7 @@
         </w:rPr>
         <w:t>EMA</w:t>
       </w:r>
-      <w:commentRangeEnd w:id="36"/>
+      <w:commentRangeEnd w:id="37"/>
       <w:r>
         <w:rPr>
           <w:rStyle w:val="Kommentarhenvisning"/>
@@ -9742,7 +9684,7 @@
           <w:szCs w:val="24"/>
           <w:lang w:val="en-US"/>
         </w:rPr>
-        <w:commentReference w:id="36"/>
+        <w:commentReference w:id="37"/>
       </w:r>
       <w:r>
         <w:rPr>
@@ -9848,21 +9790,7 @@
           <w:color w:val="215E99" w:themeColor="text2" w:themeTint="BF"/>
           <w:lang w:val="en-US"/>
         </w:rPr>
-        <w:t xml:space="preserve">can be used when the aim is to understand the treatment effect (function 1 and 2 of the secondary analyses). Note that if the primary outcome is a composite (e.g. </w:t>
-      </w:r>
-      <w:r>
-        <w:rPr>
-          <w:color w:val="215E99" w:themeColor="text2" w:themeTint="BF"/>
-          <w:lang w:val="en-US"/>
-        </w:rPr>
-        <w:t>average pain score during follow-up</w:t>
-      </w:r>
-      <w:r>
-        <w:rPr>
-          <w:color w:val="215E99" w:themeColor="text2" w:themeTint="BF"/>
-          <w:lang w:val="en-US"/>
-        </w:rPr>
-        <w:t>) the point would be to understand the contribution of each element (e.g. what timepoints bring most benefit) and not trying to make a claim for each element (e.g. testing the treatment effect at each timepoint).</w:t>
+        <w:t>can be used when the aim is to understand the treatment effect (function 1 and 2 of the secondary analyses). Note that if the primary outcome is a composite (e.g. average pain score during follow-up) the point would be to understand the contribution of each element (e.g. what timepoints bring most benefit) and not trying to make a claim for each element (e.g. testing the treatment effect at each timepoint).</w:t>
       </w:r>
     </w:p>
     <w:p>
@@ -9933,21 +9861,7 @@
           <w:color w:val="215E99" w:themeColor="text2" w:themeTint="BF"/>
           <w:lang w:val="en-US"/>
         </w:rPr>
-        <w:t xml:space="preserve">strong </w:t>
-      </w:r>
-      <w:r>
-        <w:rPr>
-          <w:color w:val="215E99" w:themeColor="text2" w:themeTint="BF"/>
-          <w:lang w:val="en-US"/>
-        </w:rPr>
-        <w:t>FWER</w:t>
-      </w:r>
-      <w:r>
-        <w:rPr>
-          <w:color w:val="215E99" w:themeColor="text2" w:themeTint="BF"/>
-          <w:lang w:val="en-US"/>
-        </w:rPr>
-        <w:t xml:space="preserve"> </w:t>
+        <w:t xml:space="preserve">strong FWER </w:t>
       </w:r>
       <w:r>
         <w:rPr>
@@ -9976,7 +9890,7 @@
         </w:rPr>
         <w:t xml:space="preserve">ease of use, </w:t>
       </w:r>
-      <w:commentRangeStart w:id="37"/>
+      <w:commentRangeStart w:id="38"/>
       <w:r>
         <w:rPr>
           <w:color w:val="215E99" w:themeColor="text2" w:themeTint="BF"/>
@@ -9984,7 +9898,7 @@
         </w:rPr>
         <w:t>availability of confidence intervals</w:t>
       </w:r>
-      <w:commentRangeEnd w:id="37"/>
+      <w:commentRangeEnd w:id="38"/>
       <w:r>
         <w:rPr>
           <w:rStyle w:val="Kommentarhenvisning"/>
@@ -9993,7 +9907,7 @@
           <w:szCs w:val="24"/>
           <w:lang w:val="en-US"/>
         </w:rPr>
-        <w:commentReference w:id="37"/>
+        <w:commentReference w:id="38"/>
       </w:r>
     </w:p>
     <w:p>
@@ -12089,7 +12003,7 @@
           <w:lang w:val="en-US"/>
         </w:rPr>
         <w:drawing>
-          <wp:anchor distT="0" distB="0" distL="114300" distR="114300" simplePos="0" relativeHeight="251722752" behindDoc="0" locked="0" layoutInCell="1" allowOverlap="1" wp14:anchorId="522BF4DC" wp14:editId="00F3DAB9">
+          <wp:anchor distT="0" distB="0" distL="114300" distR="114300" simplePos="0" relativeHeight="251722752" behindDoc="0" locked="0" layoutInCell="1" allowOverlap="1" wp14:anchorId="522BF4DC" wp14:editId="4BDACC8F">
             <wp:simplePos x="0" y="0"/>
             <wp:positionH relativeFrom="margin">
               <wp:posOffset>4722495</wp:posOffset>
@@ -12213,7 +12127,56 @@
           <w:lang w:val="en-US"/>
         </w:rPr>
       </w:pPr>
-      <w:commentRangeStart w:id="38"/>
+      <w:r>
+        <w:rPr>
+          <w:color w:val="215E99" w:themeColor="text2" w:themeTint="BF"/>
+          <w:lang w:val="en-US"/>
+        </w:rPr>
+        <w:t>Single-step procedure</w:t>
+      </w:r>
+      <w:r>
+        <w:rPr>
+          <w:color w:val="215E99" w:themeColor="text2" w:themeTint="BF"/>
+          <w:lang w:val="en-US"/>
+        </w:rPr>
+        <w:t>s</w:t>
+      </w:r>
+      <w:r>
+        <w:rPr>
+          <w:color w:val="215E99" w:themeColor="text2" w:themeTint="BF"/>
+          <w:lang w:val="en-US"/>
+        </w:rPr>
+        <w:t xml:space="preserve"> account</w:t>
+      </w:r>
+      <w:r>
+        <w:rPr>
+          <w:color w:val="215E99" w:themeColor="text2" w:themeTint="BF"/>
+          <w:lang w:val="en-US"/>
+        </w:rPr>
+        <w:t>ing</w:t>
+      </w:r>
+      <w:r>
+        <w:rPr>
+          <w:color w:val="215E99" w:themeColor="text2" w:themeTint="BF"/>
+          <w:lang w:val="en-US"/>
+        </w:rPr>
+        <w:t xml:space="preserve"> for </w:t>
+      </w:r>
+      <w:r>
+        <w:rPr>
+          <w:color w:val="215E99" w:themeColor="text2" w:themeTint="BF"/>
+          <w:lang w:val="en-US"/>
+        </w:rPr>
+        <w:t xml:space="preserve">the </w:t>
+      </w:r>
+      <w:r>
+        <w:rPr>
+          <w:color w:val="215E99" w:themeColor="text2" w:themeTint="BF"/>
+          <w:lang w:val="en-US"/>
+        </w:rPr>
+        <w:t>correlation between test statistics (</w:t>
+      </w:r>
+      <w:commentRangeStart w:id="39"/>
       <w:r>
         <w:rPr>
           <w:color w:val="215E99" w:themeColor="text2" w:themeTint="BF"/>
@@ -12221,7 +12184,7 @@
         </w:rPr>
         <w:t xml:space="preserve">Max-test adjustment </w:t>
       </w:r>
-      <w:commentRangeEnd w:id="38"/>
+      <w:commentRangeEnd w:id="39"/>
       <w:r>
         <w:rPr>
           <w:rStyle w:val="Kommentarhenvisning"/>
@@ -12230,7 +12193,7 @@
           <w:szCs w:val="24"/>
           <w:lang w:val="en-US"/>
         </w:rPr>
-        <w:commentReference w:id="38"/>
+        <w:commentReference w:id="39"/>
       </w:r>
       <w:r>
         <w:rPr>
@@ -12239,8 +12202,8 @@
         </w:rPr>
         <w:t xml:space="preserve">or </w:t>
       </w:r>
-      <w:commentRangeStart w:id="39"/>
       <w:commentRangeStart w:id="40"/>
+      <w:commentRangeStart w:id="41"/>
       <w:r>
         <w:rPr>
           <w:color w:val="215E99" w:themeColor="text2" w:themeTint="BF"/>
@@ -12248,7 +12211,7 @@
         </w:rPr>
         <w:t>Dunnett adjustment</w:t>
       </w:r>
-      <w:commentRangeEnd w:id="39"/>
+      <w:commentRangeEnd w:id="40"/>
       <w:r>
         <w:rPr>
           <w:rStyle w:val="Kommentarhenvisning"/>
@@ -12257,9 +12220,9 @@
           <w:szCs w:val="24"/>
           <w:lang w:val="en-US"/>
         </w:rPr>
-        <w:commentReference w:id="39"/>
-      </w:r>
-      <w:commentRangeEnd w:id="40"/>
+        <w:commentReference w:id="40"/>
+      </w:r>
+      <w:commentRangeEnd w:id="41"/>
       <w:r>
         <w:rPr>
           <w:rStyle w:val="Kommentarhenvisning"/>
@@ -12268,35 +12231,28 @@
           <w:szCs w:val="24"/>
           <w:lang w:val="en-US"/>
         </w:rPr>
-        <w:commentReference w:id="40"/>
-      </w:r>
-      <w:r>
-        <w:rPr>
-          <w:color w:val="215E99" w:themeColor="text2" w:themeTint="BF"/>
-          <w:lang w:val="en-US"/>
-        </w:rPr>
-        <w:t>: account for correlation between test statistic</w:t>
-      </w:r>
-      <w:r>
-        <w:rPr>
-          <w:color w:val="215E99" w:themeColor="text2" w:themeTint="BF"/>
-          <w:lang w:val="en-US"/>
-        </w:rPr>
-        <w:t>s</w:t>
-      </w:r>
-      <w:r>
-        <w:rPr>
-          <w:color w:val="215E99" w:themeColor="text2" w:themeTint="BF"/>
-          <w:lang w:val="en-US"/>
-        </w:rPr>
-        <w:t xml:space="preserve"> to </w:t>
-      </w:r>
-      <w:r>
-        <w:rPr>
-          <w:color w:val="215E99" w:themeColor="text2" w:themeTint="BF"/>
-          <w:lang w:val="en-US"/>
-        </w:rPr>
-        <w:t>obtain a less conservative adjustment</w:t>
+        <w:commentReference w:id="41"/>
+      </w:r>
+      <w:r>
+        <w:rPr>
+          <w:color w:val="215E99" w:themeColor="text2" w:themeTint="BF"/>
+          <w:lang w:val="en-US"/>
+        </w:rPr>
+        <w:t>)</w:t>
+      </w:r>
+      <w:r>
+        <w:rPr>
+          <w:color w:val="215E99" w:themeColor="text2" w:themeTint="BF"/>
+          <w:lang w:val="en-US"/>
+        </w:rPr>
+        <w:t xml:space="preserve">: </w:t>
+      </w:r>
+      <w:r>
+        <w:rPr>
+          <w:color w:val="215E99" w:themeColor="text2" w:themeTint="BF"/>
+          <w:lang w:val="en-US"/>
+        </w:rPr>
+        <w:t>less conservative adjustment</w:t>
       </w:r>
       <w:r>
         <w:rPr>
@@ -12312,6 +12268,15 @@
         </w:rPr>
         <w:t>. Can be anti-conservative in small samples and require dedicated software. Adjusted confidence intervals are available.</w:t>
       </w:r>
+    </w:p>
+    <w:p>
+      <w:pPr>
+        <w:pStyle w:val="Listeafsnit"/>
+        <w:rPr>
+          <w:color w:val="215E99" w:themeColor="text2" w:themeTint="BF"/>
+          <w:lang w:val="en-US"/>
+        </w:rPr>
+      </w:pPr>
     </w:p>
     <w:p>
       <w:pPr>
@@ -12320,6 +12285,7 @@
           <w:ilvl w:val="0"/>
           <w:numId w:val="28"/>
         </w:numPr>
+        <w:spacing w:after="0"/>
         <w:rPr>
           <w:color w:val="215E99" w:themeColor="text2" w:themeTint="BF"/>
           <w:lang w:val="en-US"/>
@@ -12353,7 +12319,7 @@
         </w:rPr>
         <w:t xml:space="preserve">for the lowest p-value but less conservative second lowest, third lowest, … p-values. Easy to implement but </w:t>
       </w:r>
-      <w:commentRangeStart w:id="41"/>
+      <w:commentRangeStart w:id="42"/>
       <w:r>
         <w:rPr>
           <w:color w:val="215E99" w:themeColor="text2" w:themeTint="BF"/>
@@ -12368,7 +12334,7 @@
         </w:rPr>
         <w:t>s compatible with the p-value and that are informative is still a research topic</w:t>
       </w:r>
-      <w:commentRangeEnd w:id="41"/>
+      <w:commentRangeEnd w:id="42"/>
       <w:r>
         <w:rPr>
           <w:rStyle w:val="Kommentarhenvisning"/>
@@ -12377,7 +12343,7 @@
           <w:szCs w:val="24"/>
           <w:lang w:val="en-US"/>
         </w:rPr>
-        <w:commentReference w:id="41"/>
+        <w:commentReference w:id="42"/>
       </w:r>
       <w:r>
         <w:rPr>
@@ -12386,6 +12352,15 @@
         </w:rPr>
         <w:t>.</w:t>
       </w:r>
+    </w:p>
+    <w:p>
+      <w:pPr>
+        <w:spacing w:after="0"/>
+        <w:rPr>
+          <w:color w:val="215E99" w:themeColor="text2" w:themeTint="BF"/>
+          <w:lang w:val="en-US"/>
+        </w:rPr>
+      </w:pPr>
     </w:p>
     <w:p>
       <w:pPr>
@@ -12404,17 +12379,143 @@
           <w:color w:val="215E99" w:themeColor="text2" w:themeTint="BF"/>
           <w:lang w:val="en-US"/>
         </w:rPr>
-        <w:t xml:space="preserve">Step up procedures such as </w:t>
-      </w:r>
-      <w:commentRangeStart w:id="42"/>
-      <w:r>
-        <w:rPr>
-          <w:color w:val="215E99" w:themeColor="text2" w:themeTint="BF"/>
-          <w:lang w:val="en-US"/>
-        </w:rPr>
-        <w:t>Hochberg</w:t>
-      </w:r>
-      <w:commentRangeEnd w:id="42"/>
+        <w:t xml:space="preserve">Step up procedures such as Hochberg: for </w:t>
+      </w:r>
+      <w:r>
+        <w:rPr>
+          <w:color w:val="215E99" w:themeColor="text2" w:themeTint="BF"/>
+          <w:lang w:val="en-US"/>
+        </w:rPr>
+        <w:t>instance,</w:t>
+      </w:r>
+      <w:r>
+        <w:rPr>
+          <w:color w:val="215E99" w:themeColor="text2" w:themeTint="BF"/>
+          <w:lang w:val="en-US"/>
+        </w:rPr>
+        <w:t xml:space="preserve"> with two hypotheses and p-values (0.03, and 0.04) Hochberg would reject both while Bonferroni would reject none. It</w:t>
+      </w:r>
+      <w:r>
+        <w:rPr>
+          <w:color w:val="215E99" w:themeColor="text2" w:themeTint="BF"/>
+          <w:lang w:val="en-US"/>
+        </w:rPr>
+        <w:t xml:space="preserve"> is essentially the same adjustment as Bonferroni-Holm except that the p-values are capped when exceeding the adjusted p-value of the less significant test leading to </w:t>
+      </w:r>
+      <w:r>
+        <w:rPr>
+          <w:color w:val="215E99" w:themeColor="text2" w:themeTint="BF"/>
+          <w:lang w:val="en-US"/>
+        </w:rPr>
+        <w:t xml:space="preserve">a </w:t>
+      </w:r>
+      <w:r>
+        <w:rPr>
+          <w:color w:val="215E99" w:themeColor="text2" w:themeTint="BF"/>
+          <w:lang w:val="en-US"/>
+        </w:rPr>
+        <w:t xml:space="preserve">power </w:t>
+      </w:r>
+      <w:r>
+        <w:rPr>
+          <w:color w:val="215E99" w:themeColor="text2" w:themeTint="BF"/>
+          <w:lang w:val="en-US"/>
+        </w:rPr>
+        <w:t xml:space="preserve">gain when </w:t>
+      </w:r>
+      <w:r>
+        <w:rPr>
+          <w:color w:val="215E99" w:themeColor="text2" w:themeTint="BF"/>
+          <w:lang w:val="en-US"/>
+        </w:rPr>
+        <w:t xml:space="preserve">(some) </w:t>
+      </w:r>
+      <w:r>
+        <w:rPr>
+          <w:color w:val="215E99" w:themeColor="text2" w:themeTint="BF"/>
+          <w:lang w:val="en-US"/>
+        </w:rPr>
+        <w:t>p-value</w:t>
+      </w:r>
+      <w:r>
+        <w:rPr>
+          <w:color w:val="215E99" w:themeColor="text2" w:themeTint="BF"/>
+          <w:lang w:val="en-US"/>
+        </w:rPr>
+        <w:t>s</w:t>
+      </w:r>
+      <w:r>
+        <w:rPr>
+          <w:color w:val="215E99" w:themeColor="text2" w:themeTint="BF"/>
+          <w:lang w:val="en-US"/>
+        </w:rPr>
+        <w:t xml:space="preserve"> are</w:t>
+      </w:r>
+      <w:r>
+        <w:rPr>
+          <w:color w:val="215E99" w:themeColor="text2" w:themeTint="BF"/>
+          <w:lang w:val="en-US"/>
+        </w:rPr>
+        <w:t xml:space="preserve"> of similar magnitude</w:t>
+      </w:r>
+      <w:r>
+        <w:rPr>
+          <w:color w:val="215E99" w:themeColor="text2" w:themeTint="BF"/>
+          <w:lang w:val="en-US"/>
+        </w:rPr>
+        <w:t>.</w:t>
+      </w:r>
+      <w:r>
+        <w:rPr>
+          <w:color w:val="215E99" w:themeColor="text2" w:themeTint="BF"/>
+          <w:lang w:val="en-US"/>
+        </w:rPr>
+        <w:t xml:space="preserve"> Easy to implement but adjusted confidence intervals compatible with the p-value and that are informative is still a research topic.</w:t>
+      </w:r>
+      <w:r>
+        <w:rPr>
+          <w:color w:val="215E99" w:themeColor="text2" w:themeTint="BF"/>
+          <w:lang w:val="en-US"/>
+        </w:rPr>
+        <w:t xml:space="preserve"> It has been shown to provide strong control of the FWER </w:t>
+      </w:r>
+      <w:r>
+        <w:rPr>
+          <w:color w:val="215E99" w:themeColor="text2" w:themeTint="BF"/>
+          <w:lang w:val="en-US"/>
+        </w:rPr>
+        <w:t xml:space="preserve">(i) </w:t>
+      </w:r>
+      <w:r>
+        <w:rPr>
+          <w:color w:val="215E99" w:themeColor="text2" w:themeTint="BF"/>
+          <w:lang w:val="en-US"/>
+        </w:rPr>
+        <w:t>for</w:t>
+      </w:r>
+      <w:r>
+        <w:rPr>
+          <w:color w:val="215E99" w:themeColor="text2" w:themeTint="BF"/>
+          <w:lang w:val="en-US"/>
+        </w:rPr>
+        <w:t xml:space="preserve"> </w:t>
+      </w:r>
+      <w:commentRangeStart w:id="43"/>
+      <w:r>
+        <w:rPr>
+          <w:color w:val="215E99" w:themeColor="text2" w:themeTint="BF"/>
+          <w:lang w:val="en-US"/>
+        </w:rPr>
+        <w:t xml:space="preserve">2 two-sided </w:t>
+      </w:r>
+      <w:r>
+        <w:rPr>
+          <w:color w:val="215E99" w:themeColor="text2" w:themeTint="BF"/>
+          <w:lang w:val="en-US"/>
+        </w:rPr>
+        <w:t xml:space="preserve">tests </w:t>
+      </w:r>
+      <w:commentRangeEnd w:id="43"/>
       <w:r>
         <w:rPr>
           <w:rStyle w:val="Kommentarhenvisning"/>
@@ -12423,28 +12524,42 @@
           <w:szCs w:val="24"/>
           <w:lang w:val="en-US"/>
         </w:rPr>
-        <w:commentReference w:id="42"/>
-      </w:r>
-      <w:r>
-        <w:rPr>
-          <w:color w:val="215E99" w:themeColor="text2" w:themeTint="BF"/>
-          <w:lang w:val="en-US"/>
-        </w:rPr>
-        <w:t xml:space="preserve">: for </w:t>
-      </w:r>
-      <w:r>
-        <w:rPr>
-          <w:color w:val="215E99" w:themeColor="text2" w:themeTint="BF"/>
-          <w:lang w:val="en-US"/>
-        </w:rPr>
-        <w:t>instance,</w:t>
-      </w:r>
-      <w:r>
-        <w:rPr>
-          <w:color w:val="215E99" w:themeColor="text2" w:themeTint="BF"/>
-          <w:lang w:val="en-US"/>
-        </w:rPr>
-        <w:t xml:space="preserve"> with two hypotheses and p-values (0.03, and 0.04) Hochberg would reject both while Bonferroni would reject none. It generally provide</w:t>
+        <w:commentReference w:id="43"/>
+      </w:r>
+      <w:r>
+        <w:rPr>
+          <w:color w:val="215E99" w:themeColor="text2" w:themeTint="BF"/>
+          <w:lang w:val="en-US"/>
+        </w:rPr>
+        <w:t xml:space="preserve">following a multivariate normal or t-distribution (e.g., t-test, Wald test, …) </w:t>
+      </w:r>
+      <w:r>
+        <w:rPr>
+          <w:color w:val="215E99" w:themeColor="text2" w:themeTint="BF"/>
+          <w:lang w:val="en-US"/>
+        </w:rPr>
+        <w:t>(</w:t>
+      </w:r>
+      <w:r>
+        <w:rPr>
+          <w:color w:val="215E99" w:themeColor="text2" w:themeTint="BF"/>
+          <w:lang w:val="en-US"/>
+        </w:rPr>
+        <w:t>i</w:t>
+      </w:r>
+      <w:r>
+        <w:rPr>
+          <w:color w:val="215E99" w:themeColor="text2" w:themeTint="BF"/>
+          <w:lang w:val="en-US"/>
+        </w:rPr>
+        <w:t xml:space="preserve">i) </w:t>
+      </w:r>
+      <w:r>
+        <w:rPr>
+          <w:color w:val="215E99" w:themeColor="text2" w:themeTint="BF"/>
+          <w:lang w:val="en-US"/>
+        </w:rPr>
+        <w:t>or with an arbitrary number of test</w:t>
       </w:r>
       <w:r>
         <w:rPr>
@@ -12458,46 +12573,80 @@
           <w:color w:val="215E99" w:themeColor="text2" w:themeTint="BF"/>
           <w:lang w:val="en-US"/>
         </w:rPr>
-        <w:t xml:space="preserve"> a gain when all p-value</w:t>
-      </w:r>
-      <w:r>
-        <w:rPr>
-          <w:color w:val="215E99" w:themeColor="text2" w:themeTint="BF"/>
-          <w:lang w:val="en-US"/>
-        </w:rPr>
-        <w:t>s</w:t>
-      </w:r>
-      <w:r>
-        <w:rPr>
-          <w:color w:val="215E99" w:themeColor="text2" w:themeTint="BF"/>
-          <w:lang w:val="en-US"/>
-        </w:rPr>
-        <w:t xml:space="preserve"> are small (below 5%) but none is very small (below 5%/number of tests). Nevertheless proof that it controls the type 1 error require</w:t>
-      </w:r>
-      <w:r>
-        <w:rPr>
-          <w:color w:val="215E99" w:themeColor="text2" w:themeTint="BF"/>
-          <w:lang w:val="en-US"/>
-        </w:rPr>
-        <w:t>s</w:t>
-      </w:r>
-      <w:r>
-        <w:rPr>
-          <w:color w:val="215E99" w:themeColor="text2" w:themeTint="BF"/>
-          <w:lang w:val="en-US"/>
-        </w:rPr>
-        <w:t xml:space="preserve"> a specific dependence between test statistics, typically non-negative correlations.</w:t>
-      </w:r>
-      <w:r>
-        <w:rPr>
-          <w:color w:val="215E99" w:themeColor="text2" w:themeTint="BF"/>
-          <w:lang w:val="en-US"/>
-        </w:rPr>
-        <w:t xml:space="preserve"> Easy to implement but adjusted confidence intervals compatible with the p-value and that are informative is still a research topic.</w:t>
-      </w:r>
-    </w:p>
-    <w:p>
-      <w:pPr>
+        <w:t xml:space="preserve"> with </w:t>
+      </w:r>
+      <w:commentRangeStart w:id="44"/>
+      <w:r>
+        <w:rPr>
+          <w:color w:val="215E99" w:themeColor="text2" w:themeTint="BF"/>
+          <w:lang w:val="en-US"/>
+        </w:rPr>
+        <w:t>independen</w:t>
+      </w:r>
+      <w:r>
+        <w:rPr>
+          <w:color w:val="215E99" w:themeColor="text2" w:themeTint="BF"/>
+          <w:lang w:val="en-US"/>
+        </w:rPr>
+        <w:t>t</w:t>
+      </w:r>
+      <w:r>
+        <w:rPr>
+          <w:color w:val="215E99" w:themeColor="text2" w:themeTint="BF"/>
+          <w:lang w:val="en-US"/>
+        </w:rPr>
+        <w:t xml:space="preserve"> </w:t>
+      </w:r>
+      <w:r>
+        <w:rPr>
+          <w:color w:val="215E99" w:themeColor="text2" w:themeTint="BF"/>
+          <w:lang w:val="en-US"/>
+        </w:rPr>
+        <w:t xml:space="preserve">or </w:t>
+      </w:r>
+      <w:r>
+        <w:rPr>
+          <w:color w:val="215E99" w:themeColor="text2" w:themeTint="BF"/>
+          <w:lang w:val="en-US"/>
+        </w:rPr>
+        <w:t>positively dependent</w:t>
+      </w:r>
+      <w:r>
+        <w:rPr>
+          <w:color w:val="215E99" w:themeColor="text2" w:themeTint="BF"/>
+          <w:lang w:val="en-US"/>
+        </w:rPr>
+        <w:t xml:space="preserve"> </w:t>
+      </w:r>
+      <w:r>
+        <w:rPr>
+          <w:color w:val="215E99" w:themeColor="text2" w:themeTint="BF"/>
+          <w:lang w:val="en-US"/>
+        </w:rPr>
+        <w:t>test statistics</w:t>
+      </w:r>
+      <w:commentRangeEnd w:id="44"/>
+      <w:r>
+        <w:rPr>
+          <w:rStyle w:val="Kommentarhenvisning"/>
+          <w:color w:val="215E99" w:themeColor="text2" w:themeTint="BF"/>
+          <w:sz w:val="24"/>
+          <w:szCs w:val="24"/>
+          <w:lang w:val="en-US"/>
+        </w:rPr>
+        <w:commentReference w:id="44"/>
+      </w:r>
+      <w:r>
+        <w:rPr>
+          <w:color w:val="215E99" w:themeColor="text2" w:themeTint="BF"/>
+          <w:lang w:val="en-US"/>
+        </w:rPr>
+        <w:t>.</w:t>
+      </w:r>
+    </w:p>
+    <w:p>
+      <w:pPr>
+        <w:ind w:left="360"/>
         <w:rPr>
           <w:color w:val="215E99" w:themeColor="text2" w:themeTint="BF"/>
           <w:lang w:val="en-US"/>
@@ -12528,7 +12677,22 @@
     <w:p>
       <w:pPr>
         <w:rPr>
-          <w:rFonts w:ascii="Times New Roman" w:hAnsi="Times New Roman" w:cs="Times New Roman"/>
+          <w:color w:val="215E99" w:themeColor="text2" w:themeTint="BF"/>
+          <w:lang w:val="en-US"/>
+        </w:rPr>
+      </w:pPr>
+      <w:r>
+        <w:rPr>
+          <w:color w:val="215E99" w:themeColor="text2" w:themeTint="BF"/>
+          <w:lang w:val="en-US"/>
+        </w:rPr>
+        <w:br w:type="page"/>
+      </w:r>
+    </w:p>
+    <w:p>
+      <w:pPr>
+        <w:ind w:left="360"/>
+        <w:rPr>
           <w:color w:val="215E99" w:themeColor="text2" w:themeTint="BF"/>
           <w:lang w:val="en-US"/>
         </w:rPr>
@@ -12539,16 +12703,17 @@
           <w:color w:val="215E99" w:themeColor="text2" w:themeTint="BF"/>
           <w:lang w:val="en-US"/>
         </w:rPr>
+        <w:lastRenderedPageBreak/>
         <mc:AlternateContent>
           <mc:Choice Requires="wps">
             <w:drawing>
-              <wp:anchor distT="0" distB="0" distL="114300" distR="114300" simplePos="0" relativeHeight="251710464" behindDoc="0" locked="0" layoutInCell="1" allowOverlap="1" wp14:anchorId="239717FD" wp14:editId="51E1C728">
+              <wp:anchor distT="0" distB="0" distL="114300" distR="114300" simplePos="0" relativeHeight="251710464" behindDoc="0" locked="0" layoutInCell="1" allowOverlap="1" wp14:anchorId="239717FD" wp14:editId="09042A06">
                 <wp:simplePos x="0" y="0"/>
                 <wp:positionH relativeFrom="column">
-                  <wp:posOffset>110490</wp:posOffset>
+                  <wp:posOffset>153353</wp:posOffset>
                 </wp:positionH>
                 <wp:positionV relativeFrom="paragraph">
-                  <wp:posOffset>137795</wp:posOffset>
+                  <wp:posOffset>235585</wp:posOffset>
                 </wp:positionV>
                 <wp:extent cx="674914" cy="299357"/>
                 <wp:effectExtent l="0" t="0" r="11430" b="24765"/>
@@ -12619,7 +12784,7 @@
           </mc:Choice>
           <mc:Fallback>
             <w:pict>
-              <v:shape w14:anchorId="239717FD" id="_x0000_s1035" type="#_x0000_t202" style="position:absolute;margin-left:8.7pt;margin-top:10.85pt;width:53.15pt;height:23.55pt;z-index:251710464;visibility:visible;mso-wrap-style:square;mso-width-percent:0;mso-height-percent:0;mso-wrap-distance-left:9pt;mso-wrap-distance-top:0;mso-wrap-distance-right:9pt;mso-wrap-distance-bottom:0;mso-position-horizontal:absolute;mso-position-horizontal-relative:text;mso-position-vertical:absolute;mso-position-vertical-relative:text;mso-width-percent:0;mso-height-percent:0;mso-width-relative:margin;mso-height-relative:margin;v-text-anchor:top" o:gfxdata="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" fillcolor="white [3201]" strokecolor="white [3212]" strokeweight=".5pt">
+              <v:shape w14:anchorId="239717FD" id="_x0000_s1035" type="#_x0000_t202" style="position:absolute;left:0;text-align:left;margin-left:12.1pt;margin-top:18.55pt;width:53.15pt;height:23.55pt;z-index:251710464;visibility:visible;mso-wrap-style:square;mso-width-percent:0;mso-height-percent:0;mso-wrap-distance-left:9pt;mso-wrap-distance-top:0;mso-wrap-distance-right:9pt;mso-wrap-distance-bottom:0;mso-position-horizontal:absolute;mso-position-horizontal-relative:text;mso-position-vertical:absolute;mso-position-vertical-relative:text;mso-width-percent:0;mso-height-percent:0;mso-width-relative:margin;mso-height-relative:margin;v-text-anchor:top" o:gfxdata="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" fillcolor="white [3201]" strokecolor="white [3212]" strokeweight=".5pt">
                 <v:textbox>
                   <w:txbxContent>
                     <w:p>
@@ -12648,6 +12813,15 @@
           </mc:Fallback>
         </mc:AlternateContent>
       </w:r>
+    </w:p>
+    <w:p>
+      <w:pPr>
+        <w:rPr>
+          <w:rFonts w:ascii="Times New Roman" w:hAnsi="Times New Roman" w:cs="Times New Roman"/>
+          <w:color w:val="215E99" w:themeColor="text2" w:themeTint="BF"/>
+          <w:lang w:val="en-US"/>
+        </w:rPr>
+      </w:pPr>
       <w:r>
         <w:rPr>
           <w:noProof/>
@@ -14849,107 +15023,35 @@
           <w:lang w:val="en-US"/>
         </w:rPr>
       </w:pPr>
-      <w:r>
-        <w:rPr>
-          <w:color w:val="215E99" w:themeColor="text2" w:themeTint="BF"/>
-          <w:lang w:val="en-US"/>
-        </w:rPr>
-        <w:t>It is often possible to combine technics, e.g., step-down max-test</w:t>
-      </w:r>
-      <w:r>
-        <w:rPr>
-          <w:color w:val="215E99" w:themeColor="text2" w:themeTint="BF"/>
-          <w:lang w:val="en-US"/>
-        </w:rPr>
-        <w:t xml:space="preserve"> or </w:t>
-      </w:r>
-      <w:r>
-        <w:rPr>
-          <w:color w:val="215E99" w:themeColor="text2" w:themeTint="BF"/>
-          <w:lang w:val="en-US"/>
-        </w:rPr>
-        <w:t>gatekeeping used in conjunction with other adjustment technics, e.g., Bonferroni adjust H</w:t>
-      </w:r>
-      <w:r>
-        <w:rPr>
-          <w:color w:val="215E99" w:themeColor="text2" w:themeTint="BF"/>
-          <w:vertAlign w:val="subscript"/>
-          <w:lang w:val="en-US"/>
-        </w:rPr>
-        <w:t>2,1</w:t>
-      </w:r>
-      <w:r>
-        <w:rPr>
-          <w:color w:val="215E99" w:themeColor="text2" w:themeTint="BF"/>
-          <w:lang w:val="en-US"/>
-        </w:rPr>
-        <w:t xml:space="preserve"> and H</w:t>
-      </w:r>
-      <w:r>
-        <w:rPr>
-          <w:color w:val="215E99" w:themeColor="text2" w:themeTint="BF"/>
-          <w:vertAlign w:val="subscript"/>
-          <w:lang w:val="en-US"/>
-        </w:rPr>
-        <w:t>2,2</w:t>
-      </w:r>
-      <w:r>
-        <w:rPr>
-          <w:color w:val="215E99" w:themeColor="text2" w:themeTint="BF"/>
-          <w:lang w:val="en-US"/>
-        </w:rPr>
-        <w:t xml:space="preserve"> and if any is rejected Bonferroni adjust H</w:t>
-      </w:r>
-      <w:r>
-        <w:rPr>
-          <w:color w:val="215E99" w:themeColor="text2" w:themeTint="BF"/>
-          <w:vertAlign w:val="subscript"/>
-          <w:lang w:val="en-US"/>
-        </w:rPr>
-        <w:t>2,3</w:t>
-      </w:r>
-      <w:r>
-        <w:rPr>
-          <w:color w:val="215E99" w:themeColor="text2" w:themeTint="BF"/>
-          <w:lang w:val="en-US"/>
-        </w:rPr>
-        <w:t xml:space="preserve"> and H</w:t>
-      </w:r>
-      <w:r>
-        <w:rPr>
-          <w:color w:val="215E99" w:themeColor="text2" w:themeTint="BF"/>
-          <w:vertAlign w:val="subscript"/>
-          <w:lang w:val="en-US"/>
-        </w:rPr>
-        <w:t>2,4</w:t>
-      </w:r>
-      <w:r>
-        <w:rPr>
-          <w:color w:val="215E99" w:themeColor="text2" w:themeTint="BF"/>
-          <w:lang w:val="en-US"/>
-        </w:rPr>
-        <w:t>.</w:t>
-      </w:r>
-      <w:r>
-        <w:rPr>
-          <w:color w:val="215E99" w:themeColor="text2" w:themeTint="BF"/>
-          <w:lang w:val="en-US"/>
-        </w:rPr>
-        <w:t xml:space="preserve"> </w:t>
-      </w:r>
-      <w:r>
-        <w:rPr>
-          <w:color w:val="215E99" w:themeColor="text2" w:themeTint="BF"/>
-          <w:lang w:val="en-US"/>
-        </w:rPr>
-        <w:t>This can quickly become technical</w:t>
-      </w:r>
-      <w:r>
-        <w:rPr>
-          <w:color w:val="215E99" w:themeColor="text2" w:themeTint="BF"/>
-          <w:lang w:val="en-US"/>
-        </w:rPr>
-        <w:t>:</w:t>
+    </w:p>
+    <w:p>
+      <w:pPr>
+        <w:rPr>
+          <w:color w:val="215E99" w:themeColor="text2" w:themeTint="BF"/>
+          <w:lang w:val="en-US"/>
+        </w:rPr>
+      </w:pPr>
+    </w:p>
+    <w:p>
+      <w:pPr>
+        <w:rPr>
+          <w:color w:val="215E99" w:themeColor="text2" w:themeTint="BF"/>
+          <w:lang w:val="en-US"/>
+        </w:rPr>
+      </w:pPr>
+      <w:r>
+        <w:rPr>
+          <w:color w:val="215E99" w:themeColor="text2" w:themeTint="BF"/>
+          <w:lang w:val="en-US"/>
+        </w:rPr>
+        <w:t>It is possible to combine technics</w:t>
+      </w:r>
+      <w:r>
+        <w:rPr>
+          <w:color w:val="215E99" w:themeColor="text2" w:themeTint="BF"/>
+          <w:lang w:val="en-US"/>
+        </w:rPr>
+        <w:t>. Consider a trial testing two domains (cognition, anxiety) at two timepoints (short-term, long-term). The two domains are equally important but the long-term effect of higher interest than the short-term effect.</w:t>
       </w:r>
     </w:p>
     <w:p>
@@ -14969,40 +15071,78 @@
           <w:color w:val="215E99" w:themeColor="text2" w:themeTint="BF"/>
           <w:lang w:val="en-US"/>
         </w:rPr>
-        <w:t>a</w:t>
-      </w:r>
-      <w:r>
-        <w:rPr>
-          <w:color w:val="215E99" w:themeColor="text2" w:themeTint="BF"/>
-          <w:lang w:val="en-US"/>
-        </w:rPr>
-        <w:t xml:space="preserve"> </w:t>
-      </w:r>
-      <w:commentRangeStart w:id="43"/>
-      <w:r>
-        <w:rPr>
-          <w:color w:val="215E99" w:themeColor="text2" w:themeTint="BF"/>
-          <w:lang w:val="en-US"/>
-        </w:rPr>
-        <w:t xml:space="preserve">graphical representation </w:t>
-      </w:r>
-      <w:commentRangeEnd w:id="43"/>
-      <w:r>
-        <w:rPr>
-          <w:rStyle w:val="Kommentarhenvisning"/>
-          <w:color w:val="215E99" w:themeColor="text2" w:themeTint="BF"/>
-          <w:sz w:val="24"/>
-          <w:szCs w:val="24"/>
-          <w:lang w:val="en-US"/>
-        </w:rPr>
-        <w:commentReference w:id="43"/>
-      </w:r>
-      <w:r>
-        <w:rPr>
-          <w:color w:val="215E99" w:themeColor="text2" w:themeTint="BF"/>
-          <w:lang w:val="en-US"/>
-        </w:rPr>
-        <w:t>of the ranking and intended alpha spending is a good start.</w:t>
+        <w:t>G</w:t>
+      </w:r>
+      <w:r>
+        <w:rPr>
+          <w:color w:val="215E99" w:themeColor="text2" w:themeTint="BF"/>
+          <w:lang w:val="en-US"/>
+        </w:rPr>
+        <w:t xml:space="preserve">atekeeping with alpha recycling: </w:t>
+      </w:r>
+      <w:r>
+        <w:rPr>
+          <w:color w:val="215E99" w:themeColor="text2" w:themeTint="BF"/>
+          <w:lang w:val="en-US"/>
+        </w:rPr>
+        <w:t xml:space="preserve">spend all the </w:t>
+      </w:r>
+      <w:r>
+        <w:rPr>
+          <w:rFonts w:ascii="Times" w:hAnsi="Times" w:cs="Times"/>
+          <w:color w:val="215E99" w:themeColor="text2" w:themeTint="BF"/>
+          <w:lang w:val="en-US"/>
+        </w:rPr>
+        <w:t>α</w:t>
+      </w:r>
+      <w:r>
+        <w:rPr>
+          <w:color w:val="215E99" w:themeColor="text2" w:themeTint="BF"/>
+          <w:lang w:val="en-US"/>
+        </w:rPr>
+        <w:t xml:space="preserve"> to </w:t>
+      </w:r>
+      <w:r>
+        <w:rPr>
+          <w:color w:val="215E99" w:themeColor="text2" w:themeTint="BF"/>
+          <w:lang w:val="en-US"/>
+        </w:rPr>
+        <w:t xml:space="preserve">test the long-term effect of both domains </w:t>
+      </w:r>
+      <w:r>
+        <w:rPr>
+          <w:color w:val="215E99" w:themeColor="text2" w:themeTint="BF"/>
+          <w:lang w:val="en-US"/>
+        </w:rPr>
+        <w:t xml:space="preserve">(e.g. </w:t>
+      </w:r>
+      <w:r>
+        <w:rPr>
+          <w:color w:val="215E99" w:themeColor="text2" w:themeTint="BF"/>
+          <w:lang w:val="en-US"/>
+        </w:rPr>
+        <w:t>Bonferroni-Holm or Hochberg</w:t>
+      </w:r>
+      <w:r>
+        <w:rPr>
+          <w:color w:val="215E99" w:themeColor="text2" w:themeTint="BF"/>
+          <w:lang w:val="en-US"/>
+        </w:rPr>
+        <w:t>)</w:t>
+      </w:r>
+      <w:r>
+        <w:rPr>
+          <w:color w:val="215E99" w:themeColor="text2" w:themeTint="BF"/>
+          <w:lang w:val="en-US"/>
+        </w:rPr>
+        <w:t xml:space="preserve">. If both are rejected </w:t>
+      </w:r>
+      <w:r>
+        <w:rPr>
+          <w:color w:val="215E99" w:themeColor="text2" w:themeTint="BF"/>
+          <w:lang w:val="en-US"/>
+        </w:rPr>
+        <w:t>move to the short term effects.</w:t>
       </w:r>
     </w:p>
     <w:p>
@@ -15022,7 +15162,65 @@
           <w:color w:val="215E99" w:themeColor="text2" w:themeTint="BF"/>
           <w:lang w:val="en-US"/>
         </w:rPr>
-        <w:t xml:space="preserve">there may not be off-of-shelf software solutions. </w:t>
+        <w:t>Parallel gatekeeping</w:t>
+      </w:r>
+      <w:r>
+        <w:rPr>
+          <w:color w:val="215E99" w:themeColor="text2" w:themeTint="BF"/>
+          <w:lang w:val="en-US"/>
+        </w:rPr>
+        <w:t xml:space="preserve">: </w:t>
+      </w:r>
+      <w:r>
+        <w:rPr>
+          <w:color w:val="215E99" w:themeColor="text2" w:themeTint="BF"/>
+          <w:lang w:val="en-US"/>
+        </w:rPr>
+        <w:t xml:space="preserve">spend all </w:t>
+      </w:r>
+      <w:r>
+        <w:rPr>
+          <w:rFonts w:ascii="Times" w:hAnsi="Times" w:cs="Times"/>
+          <w:color w:val="215E99" w:themeColor="text2" w:themeTint="BF"/>
+          <w:lang w:val="en-US"/>
+        </w:rPr>
+        <w:t>α</w:t>
+      </w:r>
+      <w:r>
+        <w:rPr>
+          <w:rFonts w:ascii="Times" w:hAnsi="Times" w:cs="Times"/>
+          <w:color w:val="215E99" w:themeColor="text2" w:themeTint="BF"/>
+          <w:lang w:val="en-US"/>
+        </w:rPr>
+        <w:t>/2</w:t>
+      </w:r>
+      <w:r>
+        <w:rPr>
+          <w:color w:val="215E99" w:themeColor="text2" w:themeTint="BF"/>
+          <w:lang w:val="en-US"/>
+        </w:rPr>
+        <w:t xml:space="preserve"> to </w:t>
+      </w:r>
+      <w:r>
+        <w:rPr>
+          <w:color w:val="215E99" w:themeColor="text2" w:themeTint="BF"/>
+          <w:lang w:val="en-US"/>
+        </w:rPr>
+        <w:t xml:space="preserve">test </w:t>
+      </w:r>
+      <w:r>
+        <w:rPr>
+          <w:color w:val="215E99" w:themeColor="text2" w:themeTint="BF"/>
+          <w:lang w:val="en-US"/>
+        </w:rPr>
+        <w:t>each domain, starting by the long-term effect and then, if rejected, moving to the long term effect</w:t>
+      </w:r>
+      <w:r>
+        <w:rPr>
+          <w:color w:val="215E99" w:themeColor="text2" w:themeTint="BF"/>
+          <w:lang w:val="en-US"/>
+        </w:rPr>
+        <w:t>.</w:t>
       </w:r>
     </w:p>
     <w:p>
@@ -15042,6 +15240,168 @@
           <w:color w:val="215E99" w:themeColor="text2" w:themeTint="BF"/>
           <w:lang w:val="en-US"/>
         </w:rPr>
+        <w:t>…</w:t>
+      </w:r>
+    </w:p>
+    <w:p>
+      <w:pPr>
+        <w:rPr>
+          <w:color w:val="215E99" w:themeColor="text2" w:themeTint="BF"/>
+          <w:lang w:val="en-US"/>
+        </w:rPr>
+      </w:pPr>
+      <w:r>
+        <w:rPr>
+          <w:color w:val="215E99" w:themeColor="text2" w:themeTint="BF"/>
+          <w:lang w:val="en-US"/>
+        </w:rPr>
+        <w:t xml:space="preserve">More complex multiple testing procedures have been studied in the literature, some with the aim to increase power (e.g. step up max test), some to provide a finer ordering and prioritization of the hypotheses </w:t>
+      </w:r>
+      <w:commentRangeStart w:id="45"/>
+      <w:r>
+        <w:rPr>
+          <w:color w:val="215E99" w:themeColor="text2" w:themeTint="BF"/>
+          <w:lang w:val="en-US"/>
+        </w:rPr>
+        <w:t>(</w:t>
+      </w:r>
+      <w:r>
+        <w:rPr>
+          <w:color w:val="215E99" w:themeColor="text2" w:themeTint="BF"/>
+          <w:lang w:val="en-US"/>
+        </w:rPr>
+        <w:t>Parallel gatekeeping with alpha recycling</w:t>
+      </w:r>
+      <w:r>
+        <w:rPr>
+          <w:color w:val="215E99" w:themeColor="text2" w:themeTint="BF"/>
+          <w:lang w:val="en-US"/>
+        </w:rPr>
+        <w:t>: truncated Holm and Hochberg procedures)</w:t>
+      </w:r>
+      <w:commentRangeEnd w:id="45"/>
+      <w:r>
+        <w:rPr>
+          <w:rStyle w:val="Kommentarhenvisning"/>
+          <w:color w:val="215E99" w:themeColor="text2" w:themeTint="BF"/>
+          <w:sz w:val="24"/>
+          <w:szCs w:val="24"/>
+          <w:lang w:val="en-US"/>
+        </w:rPr>
+        <w:commentReference w:id="45"/>
+      </w:r>
+      <w:r>
+        <w:rPr>
+          <w:color w:val="215E99" w:themeColor="text2" w:themeTint="BF"/>
+          <w:lang w:val="en-US"/>
+        </w:rPr>
+        <w:t>. T</w:t>
+      </w:r>
+      <w:r>
+        <w:rPr>
+          <w:color w:val="215E99" w:themeColor="text2" w:themeTint="BF"/>
+          <w:lang w:val="en-US"/>
+        </w:rPr>
+        <w:t>his can quickly become technical</w:t>
+      </w:r>
+      <w:r>
+        <w:rPr>
+          <w:color w:val="215E99" w:themeColor="text2" w:themeTint="BF"/>
+          <w:lang w:val="en-US"/>
+        </w:rPr>
+        <w:t>:</w:t>
+      </w:r>
+    </w:p>
+    <w:p>
+      <w:pPr>
+        <w:pStyle w:val="Listeafsnit"/>
+        <w:numPr>
+          <w:ilvl w:val="0"/>
+          <w:numId w:val="28"/>
+        </w:numPr>
+        <w:rPr>
+          <w:color w:val="215E99" w:themeColor="text2" w:themeTint="BF"/>
+          <w:lang w:val="en-US"/>
+        </w:rPr>
+      </w:pPr>
+      <w:r>
+        <w:rPr>
+          <w:color w:val="215E99" w:themeColor="text2" w:themeTint="BF"/>
+          <w:lang w:val="en-US"/>
+        </w:rPr>
+        <w:t>a</w:t>
+      </w:r>
+      <w:r>
+        <w:rPr>
+          <w:color w:val="215E99" w:themeColor="text2" w:themeTint="BF"/>
+          <w:lang w:val="en-US"/>
+        </w:rPr>
+        <w:t xml:space="preserve"> </w:t>
+      </w:r>
+      <w:commentRangeStart w:id="46"/>
+      <w:r>
+        <w:rPr>
+          <w:color w:val="215E99" w:themeColor="text2" w:themeTint="BF"/>
+          <w:lang w:val="en-US"/>
+        </w:rPr>
+        <w:t xml:space="preserve">graphical representation </w:t>
+      </w:r>
+      <w:commentRangeEnd w:id="46"/>
+      <w:r>
+        <w:rPr>
+          <w:rStyle w:val="Kommentarhenvisning"/>
+          <w:color w:val="215E99" w:themeColor="text2" w:themeTint="BF"/>
+          <w:sz w:val="24"/>
+          <w:szCs w:val="24"/>
+          <w:lang w:val="en-US"/>
+        </w:rPr>
+        <w:commentReference w:id="46"/>
+      </w:r>
+      <w:r>
+        <w:rPr>
+          <w:color w:val="215E99" w:themeColor="text2" w:themeTint="BF"/>
+          <w:lang w:val="en-US"/>
+        </w:rPr>
+        <w:t>of the ranking and intended alpha spending is a good start.</w:t>
+      </w:r>
+    </w:p>
+    <w:p>
+      <w:pPr>
+        <w:pStyle w:val="Listeafsnit"/>
+        <w:numPr>
+          <w:ilvl w:val="0"/>
+          <w:numId w:val="28"/>
+        </w:numPr>
+        <w:rPr>
+          <w:color w:val="215E99" w:themeColor="text2" w:themeTint="BF"/>
+          <w:lang w:val="en-US"/>
+        </w:rPr>
+      </w:pPr>
+      <w:r>
+        <w:rPr>
+          <w:color w:val="215E99" w:themeColor="text2" w:themeTint="BF"/>
+          <w:lang w:val="en-US"/>
+        </w:rPr>
+        <w:t xml:space="preserve">there may not be off-of-shelf software solutions. </w:t>
+      </w:r>
+    </w:p>
+    <w:p>
+      <w:pPr>
+        <w:pStyle w:val="Listeafsnit"/>
+        <w:numPr>
+          <w:ilvl w:val="0"/>
+          <w:numId w:val="28"/>
+        </w:numPr>
+        <w:rPr>
+          <w:color w:val="215E99" w:themeColor="text2" w:themeTint="BF"/>
+          <w:lang w:val="en-US"/>
+        </w:rPr>
+      </w:pPr>
+      <w:r>
+        <w:rPr>
+          <w:color w:val="215E99" w:themeColor="text2" w:themeTint="BF"/>
+          <w:lang w:val="en-US"/>
+        </w:rPr>
         <w:t xml:space="preserve">carefully consider </w:t>
       </w:r>
       <w:r>
@@ -15063,7 +15423,21 @@
           <w:color w:val="215E99" w:themeColor="text2" w:themeTint="BF"/>
           <w:lang w:val="en-US"/>
         </w:rPr>
-        <w:t xml:space="preserve"> power worth the complexity and loss in transparency.</w:t>
+        <w:t xml:space="preserve"> power </w:t>
+      </w:r>
+      <w:r>
+        <w:rPr>
+          <w:color w:val="215E99" w:themeColor="text2" w:themeTint="BF"/>
+          <w:lang w:val="en-US"/>
+        </w:rPr>
+        <w:t>is worth</w:t>
+      </w:r>
+      <w:r>
+        <w:rPr>
+          <w:color w:val="215E99" w:themeColor="text2" w:themeTint="BF"/>
+          <w:lang w:val="en-US"/>
+        </w:rPr>
+        <w:t xml:space="preserve"> the complexity and loss in transparency.</w:t>
       </w:r>
     </w:p>
     <w:p>
@@ -15104,7 +15478,7 @@
           <w:lang w:val="en-US"/>
         </w:rPr>
       </w:pPr>
-      <w:bookmarkStart w:id="44" w:name="_Toc239334278"/>
+      <w:bookmarkStart w:id="47" w:name="_Toc239334278"/>
       <w:r>
         <w:rPr>
           <w:rFonts w:ascii="Times New Roman" w:hAnsi="Times New Roman" w:cs="Times New Roman"/>
@@ -15127,7 +15501,7 @@
         </w:rPr>
         <w:t>Analysis set</w:t>
       </w:r>
-      <w:bookmarkEnd w:id="44"/>
+      <w:bookmarkEnd w:id="47"/>
     </w:p>
     <w:p>
       <w:pPr>
@@ -15143,7 +15517,7 @@
         </w:rPr>
         <w:t xml:space="preserve">Full analysis set: </w:t>
       </w:r>
-      <w:commentRangeStart w:id="45"/>
+      <w:commentRangeStart w:id="48"/>
       <w:r>
         <w:rPr>
           <w:rFonts w:ascii="Times New Roman" w:hAnsi="Times New Roman" w:cs="Times New Roman"/>
@@ -15151,7 +15525,7 @@
         </w:rPr>
         <w:t>all randomized subjects</w:t>
       </w:r>
-      <w:commentRangeEnd w:id="45"/>
+      <w:commentRangeEnd w:id="48"/>
       <w:r>
         <w:rPr>
           <w:rStyle w:val="Kommentarhenvisning"/>
@@ -15160,7 +15534,7 @@
           <w:szCs w:val="24"/>
           <w:lang w:val="en-US"/>
         </w:rPr>
-        <w:commentReference w:id="45"/>
+        <w:commentReference w:id="48"/>
       </w:r>
     </w:p>
     <w:p>
@@ -15173,7 +15547,7 @@
           <w:lang w:val="en-US"/>
         </w:rPr>
       </w:pPr>
-      <w:commentRangeStart w:id="46"/>
+      <w:commentRangeStart w:id="49"/>
       <w:r>
         <w:rPr>
           <w:rFonts w:asciiTheme="minorHAnsi" w:eastAsiaTheme="minorHAnsi" w:hAnsiTheme="minorHAnsi" w:cstheme="minorBidi"/>
@@ -15201,7 +15575,7 @@
         </w:rPr>
         <w:t xml:space="preserve"> </w:t>
       </w:r>
-      <w:commentRangeEnd w:id="46"/>
+      <w:commentRangeEnd w:id="49"/>
       <w:r>
         <w:rPr>
           <w:rStyle w:val="Kommentarhenvisning"/>
@@ -15210,7 +15584,7 @@
           <w:szCs w:val="20"/>
           <w:lang w:val="en-US"/>
         </w:rPr>
-        <w:commentReference w:id="46"/>
+        <w:commentReference w:id="49"/>
       </w:r>
     </w:p>
     <w:p>
@@ -15423,7 +15797,7 @@
           <w:lang w:val="en-US"/>
         </w:rPr>
       </w:pPr>
-      <w:commentRangeStart w:id="47"/>
+      <w:commentRangeStart w:id="50"/>
       <w:r>
         <w:rPr>
           <w:rFonts w:ascii="Times New Roman" w:hAnsi="Times New Roman" w:cs="Times New Roman"/>
@@ -15431,7 +15805,7 @@
         </w:rPr>
         <w:t>Efficacy set</w:t>
       </w:r>
-      <w:commentRangeEnd w:id="47"/>
+      <w:commentRangeEnd w:id="50"/>
       <w:r>
         <w:rPr>
           <w:rStyle w:val="Kommentarhenvisning"/>
@@ -15440,7 +15814,7 @@
           <w:szCs w:val="24"/>
           <w:lang w:val="en-US"/>
         </w:rPr>
-        <w:commentReference w:id="47"/>
+        <w:commentReference w:id="50"/>
       </w:r>
       <w:r>
         <w:rPr>
@@ -15595,7 +15969,7 @@
           <w:lang w:val="en-US"/>
         </w:rPr>
       </w:pPr>
-      <w:bookmarkStart w:id="48" w:name="_Toc239334279"/>
+      <w:bookmarkStart w:id="51" w:name="_Toc239334279"/>
       <w:r>
         <w:rPr>
           <w:rFonts w:ascii="Times New Roman" w:hAnsi="Times New Roman" w:cs="Times New Roman"/>
@@ -15634,7 +16008,7 @@
         </w:rPr>
         <w:t>Statistical analyses</w:t>
       </w:r>
-      <w:bookmarkEnd w:id="48"/>
+      <w:bookmarkEnd w:id="51"/>
     </w:p>
     <w:p>
       <w:pPr>
@@ -15645,7 +16019,7 @@
           <w:lang w:val="en-US"/>
         </w:rPr>
       </w:pPr>
-      <w:bookmarkStart w:id="49" w:name="_Toc239334280"/>
+      <w:bookmarkStart w:id="52" w:name="_Toc239334280"/>
       <w:r>
         <w:rPr>
           <w:rStyle w:val="Svagfremhvning"/>
@@ -15670,7 +16044,7 @@
         </w:rPr>
         <w:t>General considerations</w:t>
       </w:r>
-      <w:bookmarkEnd w:id="49"/>
+      <w:bookmarkEnd w:id="52"/>
     </w:p>
     <w:p>
       <w:pPr>
@@ -15704,7 +16078,7 @@
           <w:lang w:val="en-US"/>
         </w:rPr>
       </w:pPr>
-      <w:commentRangeStart w:id="50"/>
+      <w:commentRangeStart w:id="53"/>
       <w:r>
         <w:rPr>
           <w:lang w:val="en-US"/>
@@ -15789,7 +16163,7 @@
         </w:rPr>
         <w:t>.</w:t>
       </w:r>
-      <w:commentRangeEnd w:id="50"/>
+      <w:commentRangeEnd w:id="53"/>
       <w:r>
         <w:rPr>
           <w:rStyle w:val="Kommentarhenvisning"/>
@@ -15797,7 +16171,7 @@
           <w:szCs w:val="24"/>
           <w:lang w:val="en-US"/>
         </w:rPr>
-        <w:commentReference w:id="50"/>
+        <w:commentReference w:id="53"/>
       </w:r>
     </w:p>
     <w:p>
@@ -15825,14 +16199,14 @@
         </w:rPr>
         <w:t xml:space="preserve">All tests that will be performed will be two-sided even when the research question or background knowledge corresponds to a directional hypothesis.  This is to ensure logical consistency between p-values and confidence intervals (CIs) while </w:t>
       </w:r>
-      <w:commentRangeStart w:id="51"/>
+      <w:commentRangeStart w:id="54"/>
       <w:r>
         <w:rPr>
           <w:lang w:val="en-US"/>
         </w:rPr>
         <w:t>having CIs with a finite lower and upper bound</w:t>
       </w:r>
-      <w:commentRangeEnd w:id="51"/>
+      <w:commentRangeEnd w:id="54"/>
       <w:r>
         <w:rPr>
           <w:rStyle w:val="Kommentarhenvisning"/>
@@ -15840,7 +16214,7 @@
           <w:szCs w:val="24"/>
           <w:lang w:val="en-US"/>
         </w:rPr>
-        <w:commentReference w:id="51"/>
+        <w:commentReference w:id="54"/>
       </w:r>
       <w:r>
         <w:rPr>
@@ -15915,7 +16289,7 @@
           <w:lang w:val="en-US"/>
         </w:rPr>
       </w:pPr>
-      <w:bookmarkStart w:id="52" w:name="_Toc239334281"/>
+      <w:bookmarkStart w:id="55" w:name="_Toc239334281"/>
       <w:r>
         <w:rPr>
           <w:rStyle w:val="Svagfremhvning"/>
@@ -15956,7 +16330,7 @@
         </w:rPr>
         <w:t>Software</w:t>
       </w:r>
-      <w:bookmarkEnd w:id="52"/>
+      <w:bookmarkEnd w:id="55"/>
     </w:p>
     <w:p>
       <w:pPr>
@@ -16095,7 +16469,7 @@
           <w:lang w:val="en-US"/>
         </w:rPr>
       </w:pPr>
-      <w:bookmarkStart w:id="53" w:name="_Toc239334282"/>
+      <w:bookmarkStart w:id="56" w:name="_Toc239334282"/>
       <w:r>
         <w:rPr>
           <w:rStyle w:val="Svagfremhvning"/>
@@ -16144,7 +16518,7 @@
         </w:rPr>
         <w:t>intercurrent events</w:t>
       </w:r>
-      <w:bookmarkEnd w:id="53"/>
+      <w:bookmarkEnd w:id="56"/>
     </w:p>
     <w:p>
       <w:pPr>
@@ -17428,7 +17802,7 @@
           <w:lang w:val="en-US"/>
         </w:rPr>
       </w:pPr>
-      <w:bookmarkStart w:id="54" w:name="_Toc239334283"/>
+      <w:bookmarkStart w:id="57" w:name="_Toc239334283"/>
       <w:r>
         <w:rPr>
           <w:rStyle w:val="Svagfremhvning"/>
@@ -17469,7 +17843,7 @@
         </w:rPr>
         <w:t>Handling of missing data</w:t>
       </w:r>
-      <w:bookmarkEnd w:id="54"/>
+      <w:bookmarkEnd w:id="57"/>
     </w:p>
     <w:p>
       <w:pPr>
@@ -17583,14 +17957,14 @@
         </w:rPr>
         <w:t xml:space="preserve"> For the primary and the key secondary analyses only missing outcome values are expected as the other </w:t>
       </w:r>
-      <w:commentRangeStart w:id="55"/>
+      <w:commentRangeStart w:id="58"/>
       <w:r>
         <w:rPr>
           <w:lang w:val="en-US"/>
         </w:rPr>
         <w:t>variables should be measured at baseline</w:t>
       </w:r>
-      <w:commentRangeEnd w:id="55"/>
+      <w:commentRangeEnd w:id="58"/>
       <w:r>
         <w:rPr>
           <w:rStyle w:val="Kommentarhenvisning"/>
@@ -17598,7 +17972,7 @@
           <w:szCs w:val="24"/>
           <w:lang w:val="en-US"/>
         </w:rPr>
-        <w:commentReference w:id="55"/>
+        <w:commentReference w:id="58"/>
       </w:r>
       <w:r>
         <w:rPr>
@@ -18126,7 +18500,7 @@
                 <w:lang w:val="en-US"/>
               </w:rPr>
             </w:pPr>
-            <w:commentRangeStart w:id="56"/>
+            <w:commentRangeStart w:id="59"/>
             <w:r>
               <w:rPr>
                 <w:color w:val="215E99" w:themeColor="text2" w:themeTint="BF"/>
@@ -18134,7 +18508,7 @@
               </w:rPr>
               <w:t>-</w:t>
             </w:r>
-            <w:commentRangeEnd w:id="56"/>
+            <w:commentRangeEnd w:id="59"/>
             <w:r>
               <w:rPr>
                 <w:rStyle w:val="Kommentarhenvisning"/>
@@ -18143,7 +18517,7 @@
                 <w:szCs w:val="24"/>
                 <w:lang w:val="en-US"/>
               </w:rPr>
-              <w:commentReference w:id="56"/>
+              <w:commentReference w:id="59"/>
             </w:r>
           </w:p>
         </w:tc>
@@ -18716,7 +19090,7 @@
         </w:rPr>
         <w:t xml:space="preserve"> </w:t>
       </w:r>
-      <w:commentRangeStart w:id="57"/>
+      <w:commentRangeStart w:id="60"/>
       <w:r>
         <w:rPr>
           <w:color w:val="215E99" w:themeColor="text2" w:themeTint="BF"/>
@@ -18738,7 +19112,7 @@
         </w:rPr>
         <w:t xml:space="preserve"> the follow-up of interest vs. baseline and randomization group</w:t>
       </w:r>
-      <w:commentRangeEnd w:id="57"/>
+      <w:commentRangeEnd w:id="60"/>
       <w:r>
         <w:rPr>
           <w:rStyle w:val="Kommentarhenvisning"/>
@@ -18747,7 +19121,7 @@
           <w:szCs w:val="24"/>
           <w:lang w:val="en-US"/>
         </w:rPr>
-        <w:commentReference w:id="57"/>
+        <w:commentReference w:id="60"/>
       </w:r>
       <w:r>
         <w:rPr>
@@ -18912,7 +19286,7 @@
         </w:rPr>
         <w:t xml:space="preserve"> LMM with an unstructured covariance matrix. This means having an interaction </w:t>
       </w:r>
-      <w:commentRangeStart w:id="58"/>
+      <w:commentRangeStart w:id="61"/>
       <w:r>
         <w:rPr>
           <w:color w:val="215E99" w:themeColor="text2" w:themeTint="BF"/>
@@ -18920,7 +19294,7 @@
         </w:rPr>
         <w:t>treatment</w:t>
       </w:r>
-      <w:commentRangeEnd w:id="58"/>
+      <w:commentRangeEnd w:id="61"/>
       <w:r>
         <w:rPr>
           <w:rStyle w:val="Kommentarhenvisning"/>
@@ -18929,7 +19303,7 @@
           <w:szCs w:val="24"/>
           <w:lang w:val="en-US"/>
         </w:rPr>
-        <w:commentReference w:id="58"/>
+        <w:commentReference w:id="61"/>
       </w:r>
       <w:r>
         <w:rPr>
@@ -18952,7 +19326,7 @@
         </w:rPr>
         <w:t xml:space="preserve"> I personally favor stratifying the unstructured covariance matrix on</w:t>
       </w:r>
-      <w:commentRangeStart w:id="59"/>
+      <w:commentRangeStart w:id="62"/>
       <w:r>
         <w:rPr>
           <w:color w:val="215E99" w:themeColor="text2" w:themeTint="BF"/>
@@ -18960,7 +19334,7 @@
         </w:rPr>
         <w:t xml:space="preserve"> randomization group </w:t>
       </w:r>
-      <w:commentRangeEnd w:id="59"/>
+      <w:commentRangeEnd w:id="62"/>
       <w:r>
         <w:rPr>
           <w:rStyle w:val="Kommentarhenvisning"/>
@@ -18969,7 +19343,7 @@
           <w:szCs w:val="24"/>
           <w:lang w:val="en-US"/>
         </w:rPr>
-        <w:commentReference w:id="59"/>
+        <w:commentReference w:id="62"/>
       </w:r>
       <w:r>
         <w:rPr>
@@ -19014,7 +19388,7 @@
         </w:rPr>
         <w:t xml:space="preserve"> LMM with an unstructured covariance matrix and </w:t>
       </w:r>
-      <w:commentRangeStart w:id="60"/>
+      <w:commentRangeStart w:id="63"/>
       <w:r>
         <w:rPr>
           <w:color w:val="215E99" w:themeColor="text2" w:themeTint="BF"/>
@@ -19023,7 +19397,7 @@
         <w:lastRenderedPageBreak/>
         <w:t>interaction between covariates and time</w:t>
       </w:r>
-      <w:commentRangeEnd w:id="60"/>
+      <w:commentRangeEnd w:id="63"/>
       <w:r>
         <w:rPr>
           <w:rStyle w:val="Kommentarhenvisning"/>
@@ -19032,7 +19406,7 @@
           <w:szCs w:val="24"/>
           <w:lang w:val="en-US"/>
         </w:rPr>
-        <w:commentReference w:id="60"/>
+        <w:commentReference w:id="63"/>
       </w:r>
       <w:r>
         <w:rPr>
@@ -19469,7 +19843,7 @@
           <w:lang w:val="en-US"/>
         </w:rPr>
       </w:pPr>
-      <w:bookmarkStart w:id="61" w:name="_Toc239334284"/>
+      <w:bookmarkStart w:id="64" w:name="_Toc239334284"/>
       <w:r>
         <w:rPr>
           <w:rFonts w:ascii="Times New Roman" w:hAnsi="Times New Roman" w:cs="Times New Roman"/>
@@ -19492,7 +19866,7 @@
         </w:rPr>
         <w:t>Supplementary analyses</w:t>
       </w:r>
-      <w:bookmarkEnd w:id="61"/>
+      <w:bookmarkEnd w:id="64"/>
     </w:p>
     <w:p>
       <w:pPr>
@@ -19502,7 +19876,7 @@
           <w:lang w:val="en-US"/>
         </w:rPr>
       </w:pPr>
-      <w:bookmarkStart w:id="62" w:name="_Toc239334285"/>
+      <w:bookmarkStart w:id="65" w:name="_Toc239334285"/>
       <w:r>
         <w:rPr>
           <w:rStyle w:val="Svagfremhvning"/>
@@ -19542,7 +19916,7 @@
         </w:rPr>
         <w:t>Safety evaluations</w:t>
       </w:r>
-      <w:bookmarkEnd w:id="62"/>
+      <w:bookmarkEnd w:id="65"/>
     </w:p>
     <w:p>
       <w:pPr>
@@ -19573,7 +19947,7 @@
         </w:rPr>
         <w:t xml:space="preserve">From </w:t>
       </w:r>
-      <w:commentRangeStart w:id="63"/>
+      <w:commentRangeStart w:id="66"/>
       <w:r>
         <w:rPr>
           <w:color w:val="215E99" w:themeColor="text2" w:themeTint="BF"/>
@@ -19581,7 +19955,7 @@
         </w:rPr>
         <w:t>EMA</w:t>
       </w:r>
-      <w:commentRangeEnd w:id="63"/>
+      <w:commentRangeEnd w:id="66"/>
       <w:r>
         <w:rPr>
           <w:rStyle w:val="Kommentarhenvisning"/>
@@ -19590,7 +19964,7 @@
           <w:szCs w:val="24"/>
           <w:lang w:val="en-US"/>
         </w:rPr>
-        <w:commentReference w:id="63"/>
+        <w:commentReference w:id="66"/>
       </w:r>
       <w:r>
         <w:rPr>
@@ -19771,7 +20145,7 @@
           <w:lang w:val="en-US"/>
         </w:rPr>
       </w:pPr>
-      <w:bookmarkStart w:id="64" w:name="_Toc239334286"/>
+      <w:bookmarkStart w:id="67" w:name="_Toc239334286"/>
       <w:r>
         <w:rPr>
           <w:rStyle w:val="Svagfremhvning"/>
@@ -19811,7 +20185,7 @@
         </w:rPr>
         <w:t>Exploratory analyses</w:t>
       </w:r>
-      <w:bookmarkEnd w:id="64"/>
+      <w:bookmarkEnd w:id="67"/>
       <w:r>
         <w:rPr>
           <w:rFonts w:ascii="Times New Roman" w:hAnsi="Times New Roman" w:cs="Times New Roman"/>
@@ -19861,7 +20235,7 @@
           <w:lang w:val="en-US"/>
         </w:rPr>
       </w:pPr>
-      <w:bookmarkStart w:id="65" w:name="_Toc239334287"/>
+      <w:bookmarkStart w:id="68" w:name="_Toc239334287"/>
       <w:r>
         <w:rPr>
           <w:rFonts w:ascii="Times New Roman" w:hAnsi="Times New Roman" w:cs="Times New Roman"/>
@@ -19883,7 +20257,7 @@
         </w:rPr>
         <w:t>Trial monitoring and Interim analyses</w:t>
       </w:r>
-      <w:bookmarkEnd w:id="65"/>
+      <w:bookmarkEnd w:id="68"/>
     </w:p>
     <w:p>
       <w:pPr>
@@ -19952,7 +20326,7 @@
         </w:rPr>
         <w:t xml:space="preserve">, </w:t>
       </w:r>
-      <w:commentRangeStart w:id="66"/>
+      <w:commentRangeStart w:id="69"/>
       <w:r>
         <w:rPr>
           <w:rFonts w:ascii="Times New Roman" w:hAnsi="Times New Roman" w:cs="Times New Roman"/>
@@ -19961,7 +20335,7 @@
         </w:rPr>
         <w:t>e.g.</w:t>
       </w:r>
-      <w:commentRangeEnd w:id="66"/>
+      <w:commentRangeEnd w:id="69"/>
       <w:r>
         <w:rPr>
           <w:rStyle w:val="Kommentarhenvisning"/>
@@ -19971,7 +20345,7 @@
           <w:szCs w:val="24"/>
           <w:lang w:val="en-US"/>
         </w:rPr>
-        <w:commentReference w:id="66"/>
+        <w:commentReference w:id="69"/>
       </w:r>
       <w:r>
         <w:rPr>
@@ -20370,7 +20744,7 @@
         </w:rPr>
         <w:t xml:space="preserve"> ONLY the DSMB should be unblinded at interim and it should not be expected to provide results at interim that can unblind the sponsor/research team. </w:t>
       </w:r>
-      <w:commentRangeStart w:id="67"/>
+      <w:commentRangeStart w:id="70"/>
       <w:r>
         <w:rPr>
           <w:rFonts w:ascii="Times New Roman" w:hAnsi="Times New Roman" w:cs="Times New Roman"/>
@@ -20379,7 +20753,7 @@
         </w:rPr>
         <w:t>They will ‘just’ say stop or continue the trial without further detail about the magnitude or statistical significance of the estimated intervention effect</w:t>
       </w:r>
-      <w:commentRangeEnd w:id="67"/>
+      <w:commentRangeEnd w:id="70"/>
       <w:r>
         <w:rPr>
           <w:rStyle w:val="Kommentarhenvisning"/>
@@ -20389,7 +20763,7 @@
           <w:szCs w:val="24"/>
           <w:lang w:val="en-US"/>
         </w:rPr>
-        <w:commentReference w:id="67"/>
+        <w:commentReference w:id="70"/>
       </w:r>
       <w:r>
         <w:rPr>
@@ -20441,7 +20815,7 @@
         </w:rPr>
         <w:t>i</w:t>
       </w:r>
-      <w:commentRangeStart w:id="68"/>
+      <w:commentRangeStart w:id="71"/>
       <w:r>
         <w:rPr>
           <w:rFonts w:ascii="Times New Roman" w:hAnsi="Times New Roman" w:cs="Times New Roman"/>
@@ -20450,7 +20824,7 @@
         </w:rPr>
         <w:t>ncomplete data at interim (pipeline patients) and need for a decision analysis.</w:t>
       </w:r>
-      <w:commentRangeEnd w:id="68"/>
+      <w:commentRangeEnd w:id="71"/>
       <w:r>
         <w:rPr>
           <w:rStyle w:val="Kommentarhenvisning"/>
@@ -20459,7 +20833,7 @@
           <w:szCs w:val="24"/>
           <w:lang w:val="en-US"/>
         </w:rPr>
-        <w:commentReference w:id="68"/>
+        <w:commentReference w:id="71"/>
       </w:r>
     </w:p>
     <w:p>
@@ -20520,7 +20894,7 @@
           <w:lang w:val="en-US"/>
         </w:rPr>
       </w:pPr>
-      <w:bookmarkStart w:id="69" w:name="_Toc239334288"/>
+      <w:bookmarkStart w:id="72" w:name="_Toc239334288"/>
       <w:r>
         <w:rPr>
           <w:rFonts w:ascii="Times New Roman" w:hAnsi="Times New Roman" w:cs="Times New Roman"/>
@@ -20529,7 +20903,7 @@
         <w:lastRenderedPageBreak/>
         <w:t>References</w:t>
       </w:r>
-      <w:bookmarkEnd w:id="69"/>
+      <w:bookmarkEnd w:id="72"/>
       <w:r>
         <w:rPr>
           <w:rFonts w:ascii="Times New Roman" w:hAnsi="Times New Roman" w:cs="Times New Roman"/>
@@ -20572,7 +20946,7 @@
           <w:lang w:val="en-US"/>
         </w:rPr>
       </w:pPr>
-      <w:bookmarkStart w:id="70" w:name="_Toc239334289"/>
+      <w:bookmarkStart w:id="73" w:name="_Toc239334289"/>
       <w:r>
         <w:rPr>
           <w:rFonts w:ascii="Times New Roman" w:hAnsi="Times New Roman" w:cs="Times New Roman"/>
@@ -20581,7 +20955,7 @@
         <w:lastRenderedPageBreak/>
         <w:t>Appendix A. R code for primary outcome analyses</w:t>
       </w:r>
-      <w:bookmarkEnd w:id="70"/>
+      <w:bookmarkEnd w:id="73"/>
       <w:r>
         <w:rPr>
           <w:rFonts w:ascii="Times New Roman" w:hAnsi="Times New Roman" w:cs="Times New Roman"/>
@@ -20650,7 +21024,7 @@
           <w:lang w:val="en-US"/>
         </w:rPr>
       </w:pPr>
-      <w:bookmarkStart w:id="71" w:name="_Toc239334290"/>
+      <w:bookmarkStart w:id="74" w:name="_Toc239334290"/>
       <w:r>
         <w:rPr>
           <w:rStyle w:val="Svagfremhvning"/>
@@ -20659,7 +21033,7 @@
         </w:rPr>
         <w:t>Primary analyses</w:t>
       </w:r>
-      <w:bookmarkEnd w:id="71"/>
+      <w:bookmarkEnd w:id="74"/>
       <w:r>
         <w:rPr>
           <w:rStyle w:val="Svagfremhvning"/>
@@ -21233,7 +21607,7 @@
       </w:r>
     </w:p>
   </w:comment>
-  <w:comment w:id="35" w:author="Brice Maxime Hugues Ozenne" w:date="2026-09-15T16:47:00Z" w:initials="BO">
+  <w:comment w:id="35" w:author="Brice Maxime Hugues Ozenne" w:date="2026-09-16T18:24:00Z" w:initials="BO">
     <w:p>
       <w:pPr>
         <w:pStyle w:val="Kommentartekst"/>
@@ -21245,30 +21619,22 @@
         <w:annotationRef/>
       </w:r>
       <w:r>
-        <w:t>‘Secondary endpoints which may become the basis for additional claims, significant effects in these endpoints can be considered for an additional claim only after the primary objective of the clinical trial has been achieved, and if they were part of the confirmatory strategy.’</w:t>
-      </w:r>
-    </w:p>
-    <w:p>
-      <w:pPr>
-        <w:pStyle w:val="Kommentartekst"/>
-      </w:pPr>
-      <w:r>
-        <w:t xml:space="preserve">(Section 6.2 </w:t>
+        <w:t xml:space="preserve">See </w:t>
       </w:r>
       <w:hyperlink r:id="rId8" w:history="1">
         <w:r>
           <w:rPr>
             <w:rStyle w:val="Hyperlink"/>
           </w:rPr>
-          <w:t>https://www.ema.europa.eu/en/documents/scientific-guideline/draft-guideline-multiplicity-issues-clinical-trials_en.pdf</w:t>
+          <w:t>https://doi.org/10.1002/bimj.70148</w:t>
         </w:r>
       </w:hyperlink>
       <w:r>
-        <w:t>)</w:t>
+        <w:t xml:space="preserve"> for various opinions</w:t>
       </w:r>
     </w:p>
   </w:comment>
-  <w:comment w:id="36" w:author="Brice Maxime Hugues Ozenne" w:date="2026-09-15T12:37:00Z" w:initials="BO">
+  <w:comment w:id="36" w:author="Brice Maxime Hugues Ozenne" w:date="2026-09-15T16:47:00Z" w:initials="BO">
     <w:p>
       <w:pPr>
         <w:pStyle w:val="Kommentartekst"/>
@@ -21280,7 +21646,15 @@
         <w:annotationRef/>
       </w:r>
       <w:r>
-        <w:t xml:space="preserve">Section 5.2 </w:t>
+        <w:t>‘Secondary endpoints which may become the basis for additional claims, significant effects in these endpoints can be considered for an additional claim only after the primary objective of the clinical trial has been achieved, and if they were part of the confirmatory strategy.’</w:t>
+      </w:r>
+    </w:p>
+    <w:p>
+      <w:pPr>
+        <w:pStyle w:val="Kommentartekst"/>
+      </w:pPr>
+      <w:r>
+        <w:t xml:space="preserve">(Section 6.2 </w:t>
       </w:r>
       <w:hyperlink r:id="rId9" w:history="1">
         <w:r>
@@ -21290,9 +21664,12 @@
           <w:t>https://www.ema.europa.eu/en/documents/scientific-guideline/draft-guideline-multiplicity-issues-clinical-trials_en.pdf</w:t>
         </w:r>
       </w:hyperlink>
+      <w:r>
+        <w:t>)</w:t>
+      </w:r>
     </w:p>
   </w:comment>
-  <w:comment w:id="37" w:author="Brice Maxime Hugues Ozenne" w:date="2026-09-15T15:44:00Z" w:initials="BO">
+  <w:comment w:id="37" w:author="Brice Maxime Hugues Ozenne" w:date="2026-09-15T12:37:00Z" w:initials="BO">
     <w:p>
       <w:pPr>
         <w:pStyle w:val="Kommentartekst"/>
@@ -21304,7 +21681,7 @@
         <w:annotationRef/>
       </w:r>
       <w:r>
-        <w:t xml:space="preserve">From EMA: “the availability of confidence intervals with correct coverage that allow for consistent decision making with the primary hypothesis testing strategy may be a criterion for the selection of the corresponding multiple testing procedure.” (section 1, </w:t>
+        <w:t xml:space="preserve">Section 5.2 </w:t>
       </w:r>
       <w:hyperlink r:id="rId10" w:history="1">
         <w:r>
@@ -21314,18 +21691,12 @@
           <w:t>https://www.ema.europa.eu/en/documents/scientific-guideline/draft-guideline-multiplicity-issues-clinical-trials_en.pdf</w:t>
         </w:r>
       </w:hyperlink>
-      <w:r>
-        <w:t>)</w:t>
-      </w:r>
     </w:p>
   </w:comment>
-  <w:comment w:id="38" w:author="Brice Maxime Hugues Ozenne" w:date="2026-08-27T17:13:00Z" w:initials="BO">
+  <w:comment w:id="38" w:author="Brice Maxime Hugues Ozenne" w:date="2026-09-15T15:44:00Z" w:initials="BO">
     <w:p>
       <w:pPr>
         <w:pStyle w:val="Kommentartekst"/>
-        <w:rPr>
-          <w:lang w:val="en-US"/>
-        </w:rPr>
       </w:pPr>
       <w:r>
         <w:rPr>
@@ -21334,39 +21705,7 @@
         <w:annotationRef/>
       </w:r>
       <w:r>
-        <w:t>Possible reference: 10.1002/bimj.200810425</w:t>
-      </w:r>
-    </w:p>
-  </w:comment>
-  <w:comment w:id="39" w:author="Brice Maxime Hugues Ozenne" w:date="2026-08-27T17:42:00Z" w:initials="BO">
-    <w:p>
-      <w:pPr>
-        <w:pStyle w:val="Kommentartekst"/>
-      </w:pPr>
-      <w:r>
-        <w:rPr>
-          <w:rStyle w:val="Kommentarhenvisning"/>
-        </w:rPr>
-        <w:annotationRef/>
-      </w:r>
-      <w:r>
-        <w:t xml:space="preserve">Possible reference 10.1056/NEJMra1709701 </w:t>
-      </w:r>
-    </w:p>
-  </w:comment>
-  <w:comment w:id="40" w:author="Brice Maxime Hugues Ozenne" w:date="2026-09-15T15:47:00Z" w:initials="BO">
-    <w:p>
-      <w:pPr>
-        <w:pStyle w:val="Kommentartekst"/>
-      </w:pPr>
-      <w:r>
-        <w:rPr>
-          <w:rStyle w:val="Kommentarhenvisning"/>
-        </w:rPr>
-        <w:annotationRef/>
-      </w:r>
-      <w:r>
-        <w:t xml:space="preserve">This is the terminology used by EMA, e.g., see section 5 of </w:t>
+        <w:t xml:space="preserve">From EMA: “the availability of confidence intervals with correct coverage that allow for consistent decision making with the primary hypothesis testing strategy may be a criterion for the selection of the corresponding multiple testing procedure.” (section 1, </w:t>
       </w:r>
       <w:hyperlink r:id="rId11" w:history="1">
         <w:r>
@@ -21376,12 +21715,18 @@
           <w:t>https://www.ema.europa.eu/en/documents/scientific-guideline/draft-guideline-multiplicity-issues-clinical-trials_en.pdf</w:t>
         </w:r>
       </w:hyperlink>
+      <w:r>
+        <w:t>)</w:t>
+      </w:r>
     </w:p>
   </w:comment>
-  <w:comment w:id="41" w:author="Brice Maxime Hugues Ozenne" w:date="2026-08-27T17:29:00Z" w:initials="BO">
+  <w:comment w:id="39" w:author="Brice Maxime Hugues Ozenne" w:date="2026-08-27T17:13:00Z" w:initials="BO">
     <w:p>
       <w:pPr>
         <w:pStyle w:val="Kommentartekst"/>
+        <w:rPr>
+          <w:lang w:val="en-US"/>
+        </w:rPr>
       </w:pPr>
       <w:r>
         <w:rPr>
@@ -21390,9 +21735,65 @@
         <w:annotationRef/>
       </w:r>
       <w:r>
+        <w:t>Possible reference: 10.1002/bimj.200810425</w:t>
+      </w:r>
+    </w:p>
+  </w:comment>
+  <w:comment w:id="40" w:author="Brice Maxime Hugues Ozenne" w:date="2026-08-27T17:42:00Z" w:initials="BO">
+    <w:p>
+      <w:pPr>
+        <w:pStyle w:val="Kommentartekst"/>
+      </w:pPr>
+      <w:r>
+        <w:rPr>
+          <w:rStyle w:val="Kommentarhenvisning"/>
+        </w:rPr>
+        <w:annotationRef/>
+      </w:r>
+      <w:r>
+        <w:t xml:space="preserve">Possible reference 10.1056/NEJMra1709701 </w:t>
+      </w:r>
+    </w:p>
+  </w:comment>
+  <w:comment w:id="41" w:author="Brice Maxime Hugues Ozenne" w:date="2026-09-15T15:47:00Z" w:initials="BO">
+    <w:p>
+      <w:pPr>
+        <w:pStyle w:val="Kommentartekst"/>
+      </w:pPr>
+      <w:r>
+        <w:rPr>
+          <w:rStyle w:val="Kommentarhenvisning"/>
+        </w:rPr>
+        <w:annotationRef/>
+      </w:r>
+      <w:r>
+        <w:t xml:space="preserve">This is the terminology used by EMA, e.g., see section 5 of </w:t>
+      </w:r>
+      <w:hyperlink r:id="rId12" w:history="1">
+        <w:r>
+          <w:rPr>
+            <w:rStyle w:val="Hyperlink"/>
+          </w:rPr>
+          <w:t>https://www.ema.europa.eu/en/documents/scientific-guideline/draft-guideline-multiplicity-issues-clinical-trials_en.pdf</w:t>
+        </w:r>
+      </w:hyperlink>
+    </w:p>
+  </w:comment>
+  <w:comment w:id="42" w:author="Brice Maxime Hugues Ozenne" w:date="2026-08-27T17:29:00Z" w:initials="BO">
+    <w:p>
+      <w:pPr>
+        <w:pStyle w:val="Kommentartekst"/>
+      </w:pPr>
+      <w:r>
+        <w:rPr>
+          <w:rStyle w:val="Kommentarhenvisning"/>
+        </w:rPr>
+        <w:annotationRef/>
+      </w:r>
+      <w:r>
         <w:t xml:space="preserve">Possible reference: </w:t>
       </w:r>
-      <w:hyperlink r:id="rId12" w:history="1">
+      <w:hyperlink r:id="rId13" w:history="1">
         <w:r>
           <w:rPr>
             <w:rStyle w:val="Hyperlink"/>
@@ -21402,7 +21803,7 @@
       </w:hyperlink>
     </w:p>
   </w:comment>
-  <w:comment w:id="42" w:author="Brice Maxime Hugues Ozenne" w:date="2026-08-27T17:43:00Z" w:initials="BO">
+  <w:comment w:id="43" w:author="Brice Maxime Hugues Ozenne" w:date="2026-09-16T16:50:00Z" w:initials="BO">
     <w:p>
       <w:pPr>
         <w:pStyle w:val="Kommentartekst"/>
@@ -21414,203 +21815,22 @@
         <w:annotationRef/>
       </w:r>
       <w:r>
-        <w:t xml:space="preserve">Possible reference 10.1056/NEJMra1709701 </w:t>
-      </w:r>
-    </w:p>
-  </w:comment>
-  <w:comment w:id="43" w:author="Brice Maxime Hugues Ozenne" w:date="2026-08-27T18:01:00Z" w:initials="BO">
-    <w:p>
-      <w:pPr>
-        <w:pStyle w:val="Kommentartekst"/>
-      </w:pPr>
-      <w:r>
-        <w:rPr>
-          <w:rStyle w:val="Kommentarhenvisning"/>
-        </w:rPr>
-        <w:annotationRef/>
-      </w:r>
-      <w:r>
-        <w:t xml:space="preserve">See 10.1002/sim.3495 </w:t>
-      </w:r>
-    </w:p>
-  </w:comment>
-  <w:comment w:id="45" w:author="Brice Maxime Hugues Ozenne" w:date="2026-09-03T11:08:00Z" w:initials="BO">
-    <w:p>
-      <w:pPr>
-        <w:pStyle w:val="Kommentartekst"/>
-      </w:pPr>
-      <w:r>
-        <w:rPr>
-          <w:rStyle w:val="Kommentarhenvisning"/>
-        </w:rPr>
-        <w:annotationRef/>
-      </w:r>
-      <w:r>
-        <w:t>When not true, e.g. due to post-randomized exclusion, then add ‘Randomized set’ or ‘post-randomized exclusion’ including all randomized subjects that will be used for descriptive.</w:t>
-      </w:r>
-    </w:p>
-  </w:comment>
-  <w:comment w:id="46" w:author="Brice Maxime Hugues Ozenne" w:date="2026-09-03T11:15:00Z" w:initials="BO">
-    <w:p>
-      <w:pPr>
-        <w:pStyle w:val="Kommentartekst"/>
-      </w:pPr>
-      <w:r>
-        <w:rPr>
-          <w:rStyle w:val="Kommentarhenvisning"/>
-        </w:rPr>
-        <w:annotationRef/>
-      </w:r>
-      <w:r>
-        <w:t>E9 Statistical Principles for Clinical</w:t>
-      </w:r>
-    </w:p>
-    <w:p>
-      <w:pPr>
-        <w:pStyle w:val="Kommentartekst"/>
-      </w:pPr>
-      <w:r>
-        <w:t>Trials</w:t>
-      </w:r>
-    </w:p>
-    <w:p>
-      <w:pPr>
-        <w:pStyle w:val="Kommentartekst"/>
-      </w:pPr>
-      <w:hyperlink r:id="rId13" w:history="1">
-        <w:r>
-          <w:rPr>
-            <w:rStyle w:val="Hyperlink"/>
-          </w:rPr>
-          <w:t>https://www.fda.gov/media/71336/download</w:t>
-        </w:r>
-      </w:hyperlink>
-    </w:p>
-  </w:comment>
-  <w:comment w:id="47" w:author="Brice Maxime Hugues Ozenne" w:date="2026-09-03T11:50:00Z" w:initials="BO">
-    <w:p>
-      <w:pPr>
-        <w:pStyle w:val="Kommentartekst"/>
-      </w:pPr>
-      <w:r>
-        <w:rPr>
-          <w:rStyle w:val="Kommentarhenvisning"/>
-        </w:rPr>
-        <w:annotationRef/>
-      </w:r>
-      <w:r>
-        <w:t>Efficacy measures how well an intervention works under ideal, controlled conditions, while effectiveness measures how well it works in everyday, real-world use.</w:t>
-      </w:r>
-    </w:p>
-    <w:p>
-      <w:pPr>
-        <w:pStyle w:val="Kommentartekst"/>
-      </w:pPr>
-      <w:r>
-        <w:t>So the full analysis set could also be called effectiveness set.</w:t>
-      </w:r>
-    </w:p>
-  </w:comment>
-  <w:comment w:id="50" w:author="Brice Maxime Hugues Ozenne" w:date="2026-09-03T11:02:00Z" w:initials="BO">
-    <w:p>
-      <w:pPr>
-        <w:pStyle w:val="Kommentartekst"/>
-      </w:pPr>
-      <w:r>
-        <w:rPr>
-          <w:rStyle w:val="Kommentarhenvisning"/>
-        </w:rPr>
-        <w:annotationRef/>
-      </w:r>
-      <w:r>
-        <w:t>If used what to do upon failure should be clarified</w:t>
-      </w:r>
-    </w:p>
-  </w:comment>
-  <w:comment w:id="51" w:author="Brice Maxime Hugues Ozenne" w:date="2026-09-03T11:04:00Z" w:initials="BO">
-    <w:p>
-      <w:pPr>
-        <w:pStyle w:val="Kommentartekst"/>
-      </w:pPr>
-      <w:r>
-        <w:rPr>
-          <w:rStyle w:val="Kommentarhenvisning"/>
-        </w:rPr>
-        <w:annotationRef/>
-      </w:r>
-      <w:r>
-        <w:t>CIs for one sided tests are half open, i.e. the upper bound (when testing for superiority) is + \infty.</w:t>
-      </w:r>
-    </w:p>
-    <w:p>
-      <w:pPr>
-        <w:pStyle w:val="Kommentartekst"/>
-      </w:pPr>
-      <w:r>
-        <w:t>Testing one-sided but reporting two sided Cis can lead to a CI containing 0 (i.e. no rejection) while p&lt;0.05 (i.e.) rejection which is confusing.</w:t>
-      </w:r>
-    </w:p>
-  </w:comment>
-  <w:comment w:id="55" w:author="Brice Maxime Hugues Ozenne" w:date="2026-08-27T19:08:00Z" w:initials="BO">
-    <w:p>
-      <w:pPr>
-        <w:pStyle w:val="Kommentartekst"/>
-      </w:pPr>
-      <w:r>
-        <w:rPr>
-          <w:rStyle w:val="Kommentarhenvisning"/>
-        </w:rPr>
-        <w:annotationRef/>
-      </w:r>
-      <w:r>
-        <w:t>Maybe not true in case of complex measurements (e.g. medical imaging)</w:t>
-      </w:r>
-    </w:p>
-  </w:comment>
-  <w:comment w:id="56" w:author="Brice Maxime Hugues Ozenne" w:date="2026-08-31T17:03:00Z" w:initials="BO">
-    <w:p>
-      <w:pPr>
-        <w:pStyle w:val="Kommentartekst"/>
-      </w:pPr>
-      <w:r>
-        <w:rPr>
-          <w:rStyle w:val="Kommentarhenvisning"/>
-        </w:rPr>
-        <w:annotationRef/>
-      </w:r>
-      <w:r>
-        <w:t>No missing data as handled by a hypothetical strategy</w:t>
-      </w:r>
-    </w:p>
-  </w:comment>
-  <w:comment w:id="57" w:author="Brice Maxime Hugues Ozenne" w:date="2026-09-11T11:33:00Z" w:initials="BO">
-    <w:p>
-      <w:pPr>
-        <w:pStyle w:val="Kommentartekst"/>
-      </w:pPr>
-      <w:r>
-        <w:rPr>
-          <w:rStyle w:val="Kommentarhenvisning"/>
-        </w:rPr>
-        <w:annotationRef/>
-      </w:r>
-      <w:r>
-        <w:t xml:space="preserve">Vickers 2001 BMJ </w:t>
+        <w:t xml:space="preserve">Possible reference </w:t>
       </w:r>
       <w:hyperlink r:id="rId14" w:history="1">
         <w:r>
           <w:rPr>
             <w:rStyle w:val="Hyperlink"/>
           </w:rPr>
-          <w:t>10.1136/bmj.323.7321.1123</w:t>
+          <w:t>https://doi.org/10.1002/sim.6617</w:t>
         </w:r>
       </w:hyperlink>
       <w:r>
-        <w:t xml:space="preserve"> .</w:t>
+        <w:t xml:space="preserve"> </w:t>
       </w:r>
     </w:p>
   </w:comment>
-  <w:comment w:id="58" w:author="Brice Maxime Hugues Ozenne" w:date="2026-09-11T11:40:00Z" w:initials="BO">
+  <w:comment w:id="44" w:author="Brice Maxime Hugues Ozenne" w:date="2026-09-16T14:16:00Z" w:initials="BO">
     <w:p>
       <w:pPr>
         <w:pStyle w:val="Kommentartekst"/>
@@ -21622,48 +21842,29 @@
         <w:annotationRef/>
       </w:r>
       <w:r>
-        <w:t>Treatment is not the same as randomization group! It takes the same value in both groups at baseline (say placebo) and only in the follow-up the value is group specific (say placebo or experimental). This constrains the fit to have the same baseline value - in line with the fact it was a randomized experiment.</w:t>
-      </w:r>
-    </w:p>
-  </w:comment>
-  <w:comment w:id="59" w:author="Brice Maxime Hugues Ozenne" w:date="2026-09-11T11:41:00Z" w:initials="BO">
-    <w:p>
-      <w:pPr>
-        <w:pStyle w:val="Kommentartekst"/>
-      </w:pPr>
-      <w:r>
-        <w:rPr>
-          <w:rStyle w:val="Kommentarhenvisning"/>
-        </w:rPr>
-        <w:annotationRef/>
-      </w:r>
-      <w:r>
-        <w:t>Ideally it should be treatment but software-wise it can be tricky to implement and it often does not make a big difference.</w:t>
-      </w:r>
-    </w:p>
-  </w:comment>
-  <w:comment w:id="60" w:author="Brice Maxime Hugues Ozenne" w:date="2026-09-11T11:46:00Z" w:initials="BO">
-    <w:p>
-      <w:pPr>
-        <w:pStyle w:val="Kommentartekst"/>
-      </w:pPr>
-      <w:r>
-        <w:rPr>
-          <w:rStyle w:val="Kommentarhenvisning"/>
-        </w:rPr>
-        <w:annotationRef/>
+        <w:t xml:space="preserve">Possible reference </w:t>
       </w:r>
       <w:hyperlink r:id="rId15" w:history="1">
         <w:r>
           <w:rPr>
             <w:rStyle w:val="Hyperlink"/>
           </w:rPr>
-          <w:t>https://doi.org/10.1007/s43441-021-00348-y</w:t>
+          <w:t>doi:10.1214/aos/1028144846</w:t>
         </w:r>
       </w:hyperlink>
+      <w:r>
+        <w:rPr>
+          <w:color w:val="FFFFFF"/>
+          <w:highlight w:val="black"/>
+        </w:rPr>
+        <w:t>.</w:t>
+      </w:r>
+      <w:r>
+        <w:t xml:space="preserve"> </w:t>
+      </w:r>
     </w:p>
   </w:comment>
-  <w:comment w:id="63" w:author="Brice Maxime Hugues Ozenne" w:date="2026-09-15T15:37:00Z" w:initials="BO">
+  <w:comment w:id="45" w:author="Brice Maxime Hugues Ozenne" w:date="2026-09-16T17:12:00Z" w:initials="BO">
     <w:p>
       <w:pPr>
         <w:pStyle w:val="Kommentartekst"/>
@@ -21675,19 +21876,19 @@
         <w:annotationRef/>
       </w:r>
       <w:r>
-        <w:t xml:space="preserve">Section 5.4 </w:t>
+        <w:t xml:space="preserve">See section 8 of </w:t>
       </w:r>
       <w:hyperlink r:id="rId16" w:history="1">
         <w:r>
           <w:rPr>
             <w:rStyle w:val="Hyperlink"/>
           </w:rPr>
-          <w:t>https://www.ema.europa.eu/en/documents/scientific-guideline/draft-guideline-multiplicity-issues-clinical-trials_en.pdf</w:t>
+          <w:t>https://www.fda.gov/files/drugs/published/Multiple-Endpoints-in-Clinical-Trials-Guidance-for-Industry.pdf</w:t>
         </w:r>
       </w:hyperlink>
     </w:p>
   </w:comment>
-  <w:comment w:id="66" w:author="Brice Maxime Hugues Ozenne" w:date="2026-09-03T11:29:00Z" w:initials="BO">
+  <w:comment w:id="46" w:author="Brice Maxime Hugues Ozenne" w:date="2026-08-27T18:01:00Z" w:initials="BO">
     <w:p>
       <w:pPr>
         <w:pStyle w:val="Kommentartekst"/>
@@ -21699,8 +21900,53 @@
         <w:annotationRef/>
       </w:r>
       <w:r>
-        <w:t xml:space="preserve">From </w:t>
-      </w:r>
+        <w:t xml:space="preserve">See 10.1002/sim.3495 </w:t>
+      </w:r>
+    </w:p>
+  </w:comment>
+  <w:comment w:id="48" w:author="Brice Maxime Hugues Ozenne" w:date="2026-09-03T11:08:00Z" w:initials="BO">
+    <w:p>
+      <w:pPr>
+        <w:pStyle w:val="Kommentartekst"/>
+      </w:pPr>
+      <w:r>
+        <w:rPr>
+          <w:rStyle w:val="Kommentarhenvisning"/>
+        </w:rPr>
+        <w:annotationRef/>
+      </w:r>
+      <w:r>
+        <w:t>When not true, e.g. due to post-randomized exclusion, then add ‘Randomized set’ or ‘post-randomized exclusion’ including all randomized subjects that will be used for descriptive.</w:t>
+      </w:r>
+    </w:p>
+  </w:comment>
+  <w:comment w:id="49" w:author="Brice Maxime Hugues Ozenne" w:date="2026-09-03T11:15:00Z" w:initials="BO">
+    <w:p>
+      <w:pPr>
+        <w:pStyle w:val="Kommentartekst"/>
+      </w:pPr>
+      <w:r>
+        <w:rPr>
+          <w:rStyle w:val="Kommentarhenvisning"/>
+        </w:rPr>
+        <w:annotationRef/>
+      </w:r>
+      <w:r>
+        <w:t>E9 Statistical Principles for Clinical</w:t>
+      </w:r>
+    </w:p>
+    <w:p>
+      <w:pPr>
+        <w:pStyle w:val="Kommentartekst"/>
+      </w:pPr>
+      <w:r>
+        <w:t>Trials</w:t>
+      </w:r>
+    </w:p>
+    <w:p>
+      <w:pPr>
+        <w:pStyle w:val="Kommentartekst"/>
+      </w:pPr>
       <w:hyperlink r:id="rId17" w:history="1">
         <w:r>
           <w:rPr>
@@ -21711,7 +21957,7 @@
       </w:hyperlink>
     </w:p>
   </w:comment>
-  <w:comment w:id="67" w:author="Brice Maxime Hugues Ozenne" w:date="2026-09-03T11:44:00Z" w:initials="BO">
+  <w:comment w:id="50" w:author="Brice Maxime Hugues Ozenne" w:date="2026-09-03T11:50:00Z" w:initials="BO">
     <w:p>
       <w:pPr>
         <w:pStyle w:val="Kommentartekst"/>
@@ -21723,9 +21969,209 @@
         <w:annotationRef/>
       </w:r>
       <w:r>
-        <w:t>‘Investigators should be informed only about the decision to continue or to discontinue the trial, or to implement modifications to trial procedures.’  (</w:t>
+        <w:t>Efficacy measures how well an intervention works under ideal, controlled conditions, while effectiveness measures how well it works in everyday, real-world use.</w:t>
+      </w:r>
+    </w:p>
+    <w:p>
+      <w:pPr>
+        <w:pStyle w:val="Kommentartekst"/>
+      </w:pPr>
+      <w:r>
+        <w:t>So the full analysis set could also be called effectiveness set.</w:t>
+      </w:r>
+    </w:p>
+  </w:comment>
+  <w:comment w:id="53" w:author="Brice Maxime Hugues Ozenne" w:date="2026-09-03T11:02:00Z" w:initials="BO">
+    <w:p>
+      <w:pPr>
+        <w:pStyle w:val="Kommentartekst"/>
+      </w:pPr>
+      <w:r>
+        <w:rPr>
+          <w:rStyle w:val="Kommentarhenvisning"/>
+        </w:rPr>
+        <w:annotationRef/>
+      </w:r>
+      <w:r>
+        <w:t>If used what to do upon failure should be clarified</w:t>
+      </w:r>
+    </w:p>
+  </w:comment>
+  <w:comment w:id="54" w:author="Brice Maxime Hugues Ozenne" w:date="2026-09-03T11:04:00Z" w:initials="BO">
+    <w:p>
+      <w:pPr>
+        <w:pStyle w:val="Kommentartekst"/>
+      </w:pPr>
+      <w:r>
+        <w:rPr>
+          <w:rStyle w:val="Kommentarhenvisning"/>
+        </w:rPr>
+        <w:annotationRef/>
+      </w:r>
+      <w:r>
+        <w:t>CIs for one sided tests are half open, i.e. the upper bound (when testing for superiority) is + \infty.</w:t>
+      </w:r>
+    </w:p>
+    <w:p>
+      <w:pPr>
+        <w:pStyle w:val="Kommentartekst"/>
+      </w:pPr>
+      <w:r>
+        <w:t>Testing one-sided but reporting two sided Cis can lead to a CI containing 0 (i.e. no rejection) while p&lt;0.05 (i.e.) rejection which is confusing.</w:t>
+      </w:r>
+    </w:p>
+  </w:comment>
+  <w:comment w:id="58" w:author="Brice Maxime Hugues Ozenne" w:date="2026-08-27T19:08:00Z" w:initials="BO">
+    <w:p>
+      <w:pPr>
+        <w:pStyle w:val="Kommentartekst"/>
+      </w:pPr>
+      <w:r>
+        <w:rPr>
+          <w:rStyle w:val="Kommentarhenvisning"/>
+        </w:rPr>
+        <w:annotationRef/>
+      </w:r>
+      <w:r>
+        <w:t>Maybe not true in case of complex measurements (e.g. medical imaging)</w:t>
+      </w:r>
+    </w:p>
+  </w:comment>
+  <w:comment w:id="59" w:author="Brice Maxime Hugues Ozenne" w:date="2026-08-31T17:03:00Z" w:initials="BO">
+    <w:p>
+      <w:pPr>
+        <w:pStyle w:val="Kommentartekst"/>
+      </w:pPr>
+      <w:r>
+        <w:rPr>
+          <w:rStyle w:val="Kommentarhenvisning"/>
+        </w:rPr>
+        <w:annotationRef/>
+      </w:r>
+      <w:r>
+        <w:t>No missing data as handled by a hypothetical strategy</w:t>
+      </w:r>
+    </w:p>
+  </w:comment>
+  <w:comment w:id="60" w:author="Brice Maxime Hugues Ozenne" w:date="2026-09-11T11:33:00Z" w:initials="BO">
+    <w:p>
+      <w:pPr>
+        <w:pStyle w:val="Kommentartekst"/>
+      </w:pPr>
+      <w:r>
+        <w:rPr>
+          <w:rStyle w:val="Kommentarhenvisning"/>
+        </w:rPr>
+        <w:annotationRef/>
+      </w:r>
+      <w:r>
+        <w:t xml:space="preserve">Vickers 2001 BMJ </w:t>
       </w:r>
       <w:hyperlink r:id="rId18" w:history="1">
+        <w:r>
+          <w:rPr>
+            <w:rStyle w:val="Hyperlink"/>
+          </w:rPr>
+          <w:t>10.1136/bmj.323.7321.1123</w:t>
+        </w:r>
+      </w:hyperlink>
+      <w:r>
+        <w:t xml:space="preserve"> .</w:t>
+      </w:r>
+    </w:p>
+  </w:comment>
+  <w:comment w:id="61" w:author="Brice Maxime Hugues Ozenne" w:date="2026-09-11T11:40:00Z" w:initials="BO">
+    <w:p>
+      <w:pPr>
+        <w:pStyle w:val="Kommentartekst"/>
+      </w:pPr>
+      <w:r>
+        <w:rPr>
+          <w:rStyle w:val="Kommentarhenvisning"/>
+        </w:rPr>
+        <w:annotationRef/>
+      </w:r>
+      <w:r>
+        <w:t>Treatment is not the same as randomization group! It takes the same value in both groups at baseline (say placebo) and only in the follow-up the value is group specific (say placebo or experimental). This constrains the fit to have the same baseline value - in line with the fact it was a randomized experiment.</w:t>
+      </w:r>
+    </w:p>
+  </w:comment>
+  <w:comment w:id="62" w:author="Brice Maxime Hugues Ozenne" w:date="2026-09-11T11:41:00Z" w:initials="BO">
+    <w:p>
+      <w:pPr>
+        <w:pStyle w:val="Kommentartekst"/>
+      </w:pPr>
+      <w:r>
+        <w:rPr>
+          <w:rStyle w:val="Kommentarhenvisning"/>
+        </w:rPr>
+        <w:annotationRef/>
+      </w:r>
+      <w:r>
+        <w:t>Ideally it should be treatment but software-wise it can be tricky to implement and it often does not make a big difference.</w:t>
+      </w:r>
+    </w:p>
+  </w:comment>
+  <w:comment w:id="63" w:author="Brice Maxime Hugues Ozenne" w:date="2026-09-11T11:46:00Z" w:initials="BO">
+    <w:p>
+      <w:pPr>
+        <w:pStyle w:val="Kommentartekst"/>
+      </w:pPr>
+      <w:r>
+        <w:rPr>
+          <w:rStyle w:val="Kommentarhenvisning"/>
+        </w:rPr>
+        <w:annotationRef/>
+      </w:r>
+      <w:hyperlink r:id="rId19" w:history="1">
+        <w:r>
+          <w:rPr>
+            <w:rStyle w:val="Hyperlink"/>
+          </w:rPr>
+          <w:t>https://doi.org/10.1007/s43441-021-00348-y</w:t>
+        </w:r>
+      </w:hyperlink>
+    </w:p>
+  </w:comment>
+  <w:comment w:id="66" w:author="Brice Maxime Hugues Ozenne" w:date="2026-09-15T15:37:00Z" w:initials="BO">
+    <w:p>
+      <w:pPr>
+        <w:pStyle w:val="Kommentartekst"/>
+      </w:pPr>
+      <w:r>
+        <w:rPr>
+          <w:rStyle w:val="Kommentarhenvisning"/>
+        </w:rPr>
+        <w:annotationRef/>
+      </w:r>
+      <w:r>
+        <w:t xml:space="preserve">Section 5.4 </w:t>
+      </w:r>
+      <w:hyperlink r:id="rId20" w:history="1">
+        <w:r>
+          <w:rPr>
+            <w:rStyle w:val="Hyperlink"/>
+          </w:rPr>
+          <w:t>https://www.ema.europa.eu/en/documents/scientific-guideline/draft-guideline-multiplicity-issues-clinical-trials_en.pdf</w:t>
+        </w:r>
+      </w:hyperlink>
+    </w:p>
+  </w:comment>
+  <w:comment w:id="69" w:author="Brice Maxime Hugues Ozenne" w:date="2026-09-03T11:29:00Z" w:initials="BO">
+    <w:p>
+      <w:pPr>
+        <w:pStyle w:val="Kommentartekst"/>
+      </w:pPr>
+      <w:r>
+        <w:rPr>
+          <w:rStyle w:val="Kommentarhenvisning"/>
+        </w:rPr>
+        <w:annotationRef/>
+      </w:r>
+      <w:r>
+        <w:t xml:space="preserve">From </w:t>
+      </w:r>
+      <w:hyperlink r:id="rId21" w:history="1">
         <w:r>
           <w:rPr>
             <w:rStyle w:val="Hyperlink"/>
@@ -21733,12 +22179,36 @@
           <w:t>https://www.fda.gov/media/71336/download</w:t>
         </w:r>
       </w:hyperlink>
+    </w:p>
+  </w:comment>
+  <w:comment w:id="70" w:author="Brice Maxime Hugues Ozenne" w:date="2026-09-03T11:44:00Z" w:initials="BO">
+    <w:p>
+      <w:pPr>
+        <w:pStyle w:val="Kommentartekst"/>
+      </w:pPr>
+      <w:r>
+        <w:rPr>
+          <w:rStyle w:val="Kommentarhenvisning"/>
+        </w:rPr>
+        <w:annotationRef/>
+      </w:r>
+      <w:r>
+        <w:t>‘Investigators should be informed only about the decision to continue or to discontinue the trial, or to implement modifications to trial procedures.’  (</w:t>
+      </w:r>
+      <w:hyperlink r:id="rId22" w:history="1">
+        <w:r>
+          <w:rPr>
+            <w:rStyle w:val="Hyperlink"/>
+          </w:rPr>
+          <w:t>https://www.fda.gov/media/71336/download</w:t>
+        </w:r>
+      </w:hyperlink>
       <w:r>
         <w:t>)</w:t>
       </w:r>
     </w:p>
   </w:comment>
-  <w:comment w:id="68" w:author="Brice Maxime Hugues Ozenne" w:date="2026-09-03T11:34:00Z" w:initials="BO">
+  <w:comment w:id="71" w:author="Brice Maxime Hugues Ozenne" w:date="2026-09-03T11:34:00Z" w:initials="BO">
     <w:p>
       <w:pPr>
         <w:pStyle w:val="Kommentartekst"/>
@@ -21780,6 +22250,7 @@
   <w15:commentEx w15:paraId="5BF343FE" w15:paraIdParent="53BEB1DC" w15:done="0"/>
   <w15:commentEx w15:paraId="07DDE0F0" w15:done="0"/>
   <w15:commentEx w15:paraId="413AFFA2" w15:done="0"/>
+  <w15:commentEx w15:paraId="0C69A723" w15:done="0"/>
   <w15:commentEx w15:paraId="6E82482B" w15:done="0"/>
   <w15:commentEx w15:paraId="69E96002" w15:done="0"/>
   <w15:commentEx w15:paraId="4B7A7CAE" w15:done="0"/>
@@ -21787,7 +22258,9 @@
   <w15:commentEx w15:paraId="7CDD97E1" w15:done="0"/>
   <w15:commentEx w15:paraId="65E16CDD" w15:paraIdParent="7CDD97E1" w15:done="0"/>
   <w15:commentEx w15:paraId="12A14254" w15:done="0"/>
-  <w15:commentEx w15:paraId="553AAB44" w15:done="0"/>
+  <w15:commentEx w15:paraId="4F5AAD11" w15:done="0"/>
+  <w15:commentEx w15:paraId="07916F35" w15:done="0"/>
+  <w15:commentEx w15:paraId="43CF64F9" w15:done="0"/>
   <w15:commentEx w15:paraId="40D91B98" w15:done="0"/>
   <w15:commentEx w15:paraId="6DE7A37D" w15:done="0"/>
   <w15:commentEx w15:paraId="1C6FD897" w15:done="0"/>
@@ -21830,6 +22303,7 @@
   <w16cex:commentExtensible w16cex:durableId="445FB09B" w16cex:dateUtc="2026-09-07T12:38:00Z"/>
   <w16cex:commentExtensible w16cex:durableId="1F156EC1" w16cex:dateUtc="2026-09-07T12:31:00Z"/>
   <w16cex:commentExtensible w16cex:durableId="6D09143F" w16cex:dateUtc="2026-09-15T14:15:00Z"/>
+  <w16cex:commentExtensible w16cex:durableId="696B8D89" w16cex:dateUtc="2026-09-16T16:24:00Z"/>
   <w16cex:commentExtensible w16cex:durableId="2055BDB3" w16cex:dateUtc="2026-09-15T14:47:00Z"/>
   <w16cex:commentExtensible w16cex:durableId="31B03D56" w16cex:dateUtc="2026-09-15T10:37:00Z"/>
   <w16cex:commentExtensible w16cex:durableId="1AAD4A21" w16cex:dateUtc="2026-09-15T13:44:00Z"/>
@@ -21837,7 +22311,9 @@
   <w16cex:commentExtensible w16cex:durableId="0E0D3E79" w16cex:dateUtc="2026-08-27T15:42:00Z"/>
   <w16cex:commentExtensible w16cex:durableId="150DE4A3" w16cex:dateUtc="2026-09-15T13:47:00Z"/>
   <w16cex:commentExtensible w16cex:durableId="260EA4E1" w16cex:dateUtc="2026-08-27T15:29:00Z"/>
-  <w16cex:commentExtensible w16cex:durableId="7301888E" w16cex:dateUtc="2026-08-27T15:43:00Z"/>
+  <w16cex:commentExtensible w16cex:durableId="3A7A3EE5" w16cex:dateUtc="2026-09-16T14:50:00Z"/>
+  <w16cex:commentExtensible w16cex:durableId="126D2577" w16cex:dateUtc="2026-09-16T12:16:00Z"/>
+  <w16cex:commentExtensible w16cex:durableId="13ED37BC" w16cex:dateUtc="2026-09-16T15:12:00Z"/>
   <w16cex:commentExtensible w16cex:durableId="2F346FCF" w16cex:dateUtc="2026-08-27T16:01:00Z"/>
   <w16cex:commentExtensible w16cex:durableId="49D6C74E" w16cex:dateUtc="2026-09-03T09:08:00Z"/>
   <w16cex:commentExtensible w16cex:durableId="443360E0" w16cex:dateUtc="2026-09-03T09:15:00Z"/>
@@ -21880,6 +22356,7 @@
   <w16cid:commentId w16cid:paraId="5BF343FE" w16cid:durableId="445FB09B"/>
   <w16cid:commentId w16cid:paraId="07DDE0F0" w16cid:durableId="1F156EC1"/>
   <w16cid:commentId w16cid:paraId="413AFFA2" w16cid:durableId="6D09143F"/>
+  <w16cid:commentId w16cid:paraId="0C69A723" w16cid:durableId="696B8D89"/>
   <w16cid:commentId w16cid:paraId="6E82482B" w16cid:durableId="2055BDB3"/>
   <w16cid:commentId w16cid:paraId="69E96002" w16cid:durableId="31B03D56"/>
   <w16cid:commentId w16cid:paraId="4B7A7CAE" w16cid:durableId="1AAD4A21"/>
@@ -21887,7 +22364,9 @@
   <w16cid:commentId w16cid:paraId="7CDD97E1" w16cid:durableId="0E0D3E79"/>
   <w16cid:commentId w16cid:paraId="65E16CDD" w16cid:durableId="150DE4A3"/>
   <w16cid:commentId w16cid:paraId="12A14254" w16cid:durableId="260EA4E1"/>
-  <w16cid:commentId w16cid:paraId="553AAB44" w16cid:durableId="7301888E"/>
+  <w16cid:commentId w16cid:paraId="4F5AAD11" w16cid:durableId="3A7A3EE5"/>
+  <w16cid:commentId w16cid:paraId="07916F35" w16cid:durableId="126D2577"/>
+  <w16cid:commentId w16cid:paraId="43CF64F9" w16cid:durableId="13ED37BC"/>
   <w16cid:commentId w16cid:paraId="40D91B98" w16cid:durableId="2F346FCF"/>
   <w16cid:commentId w16cid:paraId="6DE7A37D" w16cid:durableId="49D6C74E"/>
   <w16cid:commentId w16cid:paraId="1C6FD897" w16cid:durableId="443360E0"/>
@@ -26445,6 +26924,7 @@
   <w:style w:type="character" w:default="1" w:styleId="Standardskrifttypeiafsnit">
     <w:name w:val="Default Paragraph Font"/>
     <w:uiPriority w:val="1"/>
+    <w:semiHidden/>
     <w:unhideWhenUsed/>
   </w:style>
   <w:style w:type="table" w:default="1" w:styleId="Tabel-Normal">
@@ -27026,6 +27506,16 @@
       <w:szCs w:val="18"/>
     </w:rPr>
   </w:style>
+  <w:style w:type="character" w:styleId="Pladsholdertekst">
+    <w:name w:val="Placeholder Text"/>
+    <w:basedOn w:val="Standardskrifttypeiafsnit"/>
+    <w:uiPriority w:val="99"/>
+    <w:semiHidden/>
+    <w:rsid w:val="006E026B"/>
+    <w:rPr>
+      <w:color w:val="666666"/>
+    </w:rPr>
+  </w:style>
 </w:styles>
 </file>
 

</xml_diff>